<commit_message>
Simplify project structure and remove obsolete code
</commit_message>
<xml_diff>
--- a/report/StateBench_Report.docx
+++ b/report/StateBench_Report.docx
@@ -1,6 +1,6 @@
 
 <file path=word/document.xml><?xml version="1.0" encoding="utf-8"?>
-<w:document xmlns:wpc="http://schemas.microsoft.com/office/word/2010/wordprocessingCanvas" xmlns:mc="http://schemas.openxmlformats.org/markup-compatibility/2006" xmlns:o="urn:schemas-microsoft-com:office:office" xmlns:r="http://schemas.openxmlformats.org/officeDocument/2006/relationships" xmlns:m="http://schemas.openxmlformats.org/officeDocument/2006/math" xmlns:v="urn:schemas-microsoft-com:vml" xmlns:wp14="http://schemas.microsoft.com/office/word/2010/wordprocessingDrawing" xmlns:wp="http://schemas.openxmlformats.org/drawingml/2006/wordprocessingDrawing" xmlns:w10="urn:schemas-microsoft-com:office:word" xmlns:w="http://schemas.openxmlformats.org/wordprocessingml/2006/main" xmlns:w14="http://schemas.microsoft.com/office/word/2010/wordml" xmlns:w15="http://schemas.microsoft.com/office/word/2012/wordml" xmlns:w16se="http://schemas.microsoft.com/office/word/2015/wordml/symex" xmlns:w16cid="http://schemas.microsoft.com/office/word/2016/wordml/cid" xmlns:w16="http://schemas.microsoft.com/office/word/2018/wordml" xmlns:w16cex="http://schemas.microsoft.com/office/word/2018/wordml/cex" xmlns:w16sdtdh="http://schemas.microsoft.com/office/word/2020/wordml/sdtdatahash" xmlns:wne="http://schemas.microsoft.com/office/word/2006/wordml" xmlns:wpg="http://schemas.microsoft.com/office/word/2010/wordprocessingGroup" xmlns:wps="http://schemas.microsoft.com/office/word/2010/wordprocessingShape" mc:Ignorable="w14 w15 w16se w16cid w16 w16cex w16sdtdh wp14">
+<w:document xmlns:wpc="http://schemas.microsoft.com/office/word/2010/wordprocessingCanvas" xmlns:mo="http://schemas.microsoft.com/office/mac/office/2008/main" xmlns:mc="http://schemas.openxmlformats.org/markup-compatibility/2006" xmlns:mv="urn:schemas-microsoft-com:mac:vml" xmlns:o="urn:schemas-microsoft-com:office:office" xmlns:r="http://schemas.openxmlformats.org/officeDocument/2006/relationships" xmlns:m="http://schemas.openxmlformats.org/officeDocument/2006/math" xmlns:v="urn:schemas-microsoft-com:vml" xmlns:wp14="http://schemas.microsoft.com/office/word/2010/wordprocessingDrawing" xmlns:wp="http://schemas.openxmlformats.org/drawingml/2006/wordprocessingDrawing" xmlns:w10="urn:schemas-microsoft-com:office:word" xmlns:w="http://schemas.openxmlformats.org/wordprocessingml/2006/main" xmlns:w14="http://schemas.microsoft.com/office/word/2010/wordml" xmlns:wpg="http://schemas.microsoft.com/office/word/2010/wordprocessingGroup" xmlns:wpi="http://schemas.microsoft.com/office/word/2010/wordprocessingInk" xmlns:wne="http://schemas.microsoft.com/office/word/2006/wordml" xmlns:wps="http://schemas.microsoft.com/office/word/2010/wordprocessingShape" mc:Ignorable="w14 wp14">
   <w:body>
     <w:p>
       <w:pPr>
@@ -8,16 +8,6 @@
         <w:jc w:val="left"/>
       </w:pPr>
       <w:r>
-        <w:rPr>
-          <w:rFonts w:ascii="Calibri" w:hAnsi="Calibri" w:eastAsia="ＭＳ ゴシック" w:cs="Calibri" w:asciiTheme="majorHAnsi" w:hAnsiTheme="majorHAnsi" w:eastAsiaTheme="majorEastAsia" w:csTheme="majorBidi"/>
-          <w:b/>
-          <w:bCs/>
-          <w:color w:val="1F4D78"/>
-          <w:spacing w:val="5"/>
-          <w:kern w:val="28"/>
-          <w:sz w:val="38"/>
-          <w:szCs w:val="52"/>
-        </w:rPr>
         <w:t>StateBench: Working State for Reliable Multi-Step Tool Use</w:t>
       </w:r>
     </w:p>
@@ -26,33 +16,19 @@
         <w:pStyle w:val="Subtitle"/>
       </w:pPr>
       <w:r>
-        <w:rPr>
-          <w:rFonts w:ascii="Calibri" w:hAnsi="Calibri" w:eastAsia="ＭＳ ゴシック" w:cs="Calibri" w:asciiTheme="majorHAnsi" w:hAnsiTheme="majorHAnsi" w:eastAsiaTheme="majorEastAsia" w:csTheme="majorBidi"/>
-          <w:color w:val="56606C"/>
-          <w:spacing w:val="15"/>
-          <w:sz w:val="18"/>
-          <w:szCs w:val="24"/>
-        </w:rPr>
         <w:t>Representative FuncBenchGen reproduction and controlled Qwen3.6-27B extension</w:t>
       </w:r>
     </w:p>
     <w:p>
       <w:pPr>
         <w:pStyle w:val="Subtitle"/>
+        <w:spacing w:after="100"/>
         <w:pBdr>
           <w:bottom w:val="single" w:sz="8" w:space="4" w:color="2E74B5"/>
         </w:pBdr>
-        <w:spacing w:after="100"/>
       </w:pPr>
       <w:r>
-        <w:rPr>
-          <w:rFonts w:ascii="Calibri" w:hAnsi="Calibri" w:eastAsia="ＭＳ ゴシック" w:cs="Calibri" w:asciiTheme="majorHAnsi" w:hAnsiTheme="majorHAnsi" w:eastAsiaTheme="majorEastAsia"/>
-          <w:color w:val="56606C"/>
-          <w:spacing w:val="15"/>
-          <w:sz w:val="18"/>
-          <w:szCs w:val="24"/>
-        </w:rPr>
-        <w:t>LebNet Tech Fellows 2026 | Academic Paper Option | Domenico Labaki</w:t>
+        <w:t>LebNet Tech Fellows 2026 | Academic Paper Option</w:t>
       </w:r>
     </w:p>
     <w:p>
@@ -60,48 +36,38 @@
         <w:pStyle w:val="Heading1"/>
       </w:pPr>
       <w:r>
-        <w:rPr>
-          <w:rFonts w:ascii="Calibri" w:hAnsi="Calibri" w:eastAsia="ＭＳ ゴシック" w:cs="Calibri" w:asciiTheme="majorHAnsi" w:hAnsiTheme="majorHAnsi" w:eastAsiaTheme="majorEastAsia" w:csTheme="majorBidi"/>
-          <w:b/>
-          <w:bCs/>
-          <w:color w:val="2E74B5"/>
-          <w:sz w:val="24"/>
-          <w:szCs w:val="28"/>
-        </w:rPr>
         <w:t>1. Project Title &amp; Abstract</w:t>
       </w:r>
     </w:p>
     <w:p>
       <w:pPr>
         <w:keepLines/>
+        <w:spacing w:before="40" w:after="100"/>
+        <w:ind w:left="115" w:right="115"/>
+        <w:jc w:val="left"/>
+        <w:shd w:fill="E8EEF5"/>
         <w:pBdr>
           <w:top w:val="single" w:sz="4" w:space="5" w:color="4A5568"/>
           <w:left w:val="single" w:sz="4" w:space="5" w:color="4A5568"/>
           <w:bottom w:val="single" w:sz="4" w:space="5" w:color="4A5568"/>
           <w:right w:val="single" w:sz="4" w:space="5" w:color="4A5568"/>
         </w:pBdr>
-        <w:shd w:val="clear" w:fill="E8EEF5"/>
-        <w:spacing w:before="40" w:after="100"/>
-        <w:ind w:left="115" w:right="115"/>
-        <w:jc w:val="left"/>
       </w:pPr>
       <w:r>
         <w:rPr>
-          <w:rFonts w:ascii="Calibri" w:hAnsi="Calibri" w:eastAsia="ＭＳ 明朝" w:cs="Calibri" w:eastAsiaTheme="minorEastAsia" w:csTheme="minorBidi"/>
+          <w:rFonts w:ascii="Calibri" w:hAnsi="Calibri"/>
           <w:b/>
-          <w:bCs/>
           <w:color w:val="1F4D78"/>
           <w:sz w:val="19"/>
-          <w:szCs w:val="22"/>
         </w:rPr>
         <w:t xml:space="preserve">Abstract. </w:t>
       </w:r>
       <w:r>
         <w:rPr>
-          <w:rFonts w:ascii="Calibri" w:hAnsi="Calibri" w:eastAsia="ＭＳ 明朝" w:cs="Calibri" w:eastAsiaTheme="minorEastAsia" w:csTheme="minorBidi"/>
+          <w:rFonts w:ascii="Calibri" w:hAnsi="Calibri"/>
+          <w:b w:val="0"/>
           <w:color w:val="182535"/>
           <w:sz w:val="19"/>
-          <w:szCs w:val="22"/>
         </w:rPr>
         <w:t>Reliable tool-using language models must infer valid call sequences while preserving intermediate values across multiple turns. StateBench reproduces a representative subset of Maekawa et al.'s FuncBenchGen, which generates synthetic hidden function-dependency graphs with controllable depth and distractors, and extends it by comparing five representations of observed working state. A paper-style Qwen3.6-27B calibration reproduced the qualitative depth effect but reached a zero-success floor on deep and connected tasks. I therefore applied one model-compatible interface consistently across 15 frozen graphs. The original four-strategy panel contained 60 executions: full history achieved 12/15 exact successes, paper restatement 13/15, and JSON plus static dependency pruning 15/15 each. Static pruning nevertheless retained the same 404.7 cumulative state bytes as JSON. A post hoc, mechanism-driven live filter added 15 executions and achieved 13/15 while averaging 156.9 state bytes, a 61.2% reduction from JSON. It remained perfect on easy and deep tasks but fell to 3/5 with connected distractors. The results therefore support explicit structured state while exposing a compression-reliability trade-off for aggressive public-schema pruning.</w:t>
       </w:r>
@@ -111,14 +77,6 @@
         <w:pStyle w:val="Heading1"/>
       </w:pPr>
       <w:r>
-        <w:rPr>
-          <w:rFonts w:ascii="Calibri" w:hAnsi="Calibri" w:eastAsia="ＭＳ ゴシック" w:cs="Calibri" w:asciiTheme="majorHAnsi" w:hAnsiTheme="majorHAnsi" w:eastAsiaTheme="majorEastAsia" w:csTheme="majorBidi"/>
-          <w:b/>
-          <w:bCs/>
-          <w:color w:val="2E74B5"/>
-          <w:sz w:val="24"/>
-          <w:szCs w:val="28"/>
-        </w:rPr>
         <w:t>2. Introduction &amp; Problem Statement</w:t>
       </w:r>
     </w:p>
@@ -129,10 +87,11 @@
       </w:pPr>
       <w:r>
         <w:rPr>
-          <w:rFonts w:ascii="Calibri" w:hAnsi="Calibri" w:eastAsia="ＭＳ 明朝" w:cs="Calibri" w:eastAsiaTheme="minorEastAsia" w:csTheme="minorBidi"/>
+          <w:rFonts w:ascii="Calibri" w:hAnsi="Calibri"/>
+          <w:b w:val="0"/>
+          <w:i w:val="0"/>
           <w:color w:val="182535"/>
           <w:sz w:val="20"/>
-          <w:szCs w:val="22"/>
         </w:rPr>
         <w:t>Tool-augmented language models are increasingly expected to call APIs in workflows where later arguments depend on earlier outputs. A model can understand every function schema and still fail by selecting the wrong dependency path, calling a function before its inputs exist, or reusing an incorrect or stale value. Evaluation is difficult because realistic tool benchmarks are expensive to curate, expose only a few fixed difficulty levels, and can be contaminated when public tasks appear in training data or become searchable at test time.</w:t>
       </w:r>
@@ -144,10 +103,11 @@
       </w:pPr>
       <w:r>
         <w:rPr>
-          <w:rFonts w:ascii="Calibri" w:hAnsi="Calibri" w:eastAsia="ＭＳ 明朝" w:cs="Calibri" w:eastAsiaTheme="minorEastAsia" w:csTheme="minorBidi"/>
+          <w:rFonts w:ascii="Calibri" w:hAnsi="Calibri"/>
+          <w:b w:val="0"/>
+          <w:i w:val="0"/>
           <w:color w:val="182535"/>
           <w:sz w:val="20"/>
-          <w:szCs w:val="22"/>
         </w:rPr>
         <w:t>FuncBenchGen addresses these limitations by casting tool use as traversal over a hidden directed acyclic graph (DAG). Nodes are synthetic single-output functions; edges encode type-compatible dependencies. The model sees initial values, randomized tool schemas, and a target variable, but not the graph. Difficulty can be controlled through required core functions, maximum dependency depth, and irrelevant functions. Connected irrelevant nodes (CINs) are especially challenging because they share compatible types with the solution graph. The paper also reports that value-not-yet-known errors dominate execution traces and proposes restating all known variables after each call. StateBench asks the same core question while adding a focused extension: when tasks, model, schemas, call budget, and seeds are fixed, does the representation of observed working state change reliability and context cost?</w:t>
       </w:r>
@@ -155,25 +115,11 @@
     <w:tbl>
       <w:tblPr>
         <w:tblStyle w:val="TableGrid"/>
-        <w:tblW w:w="10080" w:type="dxa"/>
+        <w:tblW w:type="dxa" w:w="10080"/>
         <w:jc w:val="left"/>
+        <w:tblLook w:firstColumn="1" w:firstRow="1" w:lastColumn="0" w:lastRow="0" w:noHBand="0" w:noVBand="1" w:val="04A0"/>
         <w:tblInd w:w="120" w:type="dxa"/>
-        <w:tblBorders>
-          <w:top w:val="single" w:sz="4" w:space="0" w:color="auto"/>
-          <w:left w:val="single" w:sz="4" w:space="0" w:color="auto"/>
-          <w:bottom w:val="single" w:sz="4" w:space="0" w:color="auto"/>
-          <w:right w:val="single" w:sz="4" w:space="0" w:color="auto"/>
-          <w:insideH w:val="single" w:sz="4" w:space="0" w:color="auto"/>
-          <w:insideV w:val="single" w:sz="4" w:space="0" w:color="auto"/>
-        </w:tblBorders>
         <w:tblLayout w:type="fixed"/>
-        <w:tblCellMar>
-          <w:top w:w="0" w:type="dxa"/>
-          <w:left w:w="108" w:type="dxa"/>
-          <w:bottom w:w="0" w:type="dxa"/>
-          <w:right w:w="108" w:type="dxa"/>
-        </w:tblCellMar>
-        <w:tblLook w:firstRow="1" w:firstColumn="1" w:noVBand="1"/>
       </w:tblPr>
       <w:tblGrid>
         <w:gridCol w:w="1900"/>
@@ -182,24 +128,18 @@
       </w:tblGrid>
       <w:tr>
         <w:trPr>
+          <w:tblHeader w:val="true"/>
           <w:cantSplit/>
-          <w:tblHeader/>
         </w:trPr>
         <w:tc>
           <w:tcPr>
-            <w:tcW w:w="1900" w:type="dxa"/>
-            <w:tcBorders>
-              <w:top w:val="single" w:sz="4" w:space="0" w:color="auto"/>
-              <w:left w:val="single" w:sz="4" w:space="0" w:color="auto"/>
-              <w:bottom w:val="single" w:sz="4" w:space="0" w:color="auto"/>
-              <w:right w:val="single" w:sz="4" w:space="0" w:color="auto"/>
-            </w:tcBorders>
-            <w:shd w:val="clear" w:fill="F2F4F7"/>
+            <w:tcW w:type="dxa" w:w="1900"/>
+            <w:shd w:fill="F2F4F7"/>
             <w:tcMar>
               <w:top w:w="70" w:type="dxa"/>
-              <w:left w:w="120" w:type="dxa"/>
+              <w:start w:w="120" w:type="dxa"/>
               <w:bottom w:w="70" w:type="dxa"/>
-              <w:right w:w="120" w:type="dxa"/>
+              <w:end w:w="120" w:type="dxa"/>
             </w:tcMar>
             <w:vAlign w:val="center"/>
           </w:tcPr>
@@ -211,12 +151,10 @@
             <w:r/>
             <w:r>
               <w:rPr>
-                <w:rFonts w:ascii="Calibri" w:hAnsi="Calibri" w:eastAsia="ＭＳ 明朝" w:cs="Calibri" w:eastAsiaTheme="minorEastAsia" w:csTheme="minorBidi"/>
+                <w:rFonts w:ascii="Calibri" w:hAnsi="Calibri"/>
                 <w:b/>
-                <w:bCs/>
                 <w:color w:val="1F4D78"/>
                 <w:sz w:val="15"/>
-                <w:szCs w:val="22"/>
               </w:rPr>
               <w:t>Paper finding</w:t>
             </w:r>
@@ -224,19 +162,13 @@
         </w:tc>
         <w:tc>
           <w:tcPr>
-            <w:tcW w:w="2700" w:type="dxa"/>
-            <w:tcBorders>
-              <w:top w:val="single" w:sz="4" w:space="0" w:color="auto"/>
-              <w:left w:val="single" w:sz="4" w:space="0" w:color="auto"/>
-              <w:bottom w:val="single" w:sz="4" w:space="0" w:color="auto"/>
-              <w:right w:val="single" w:sz="4" w:space="0" w:color="auto"/>
-            </w:tcBorders>
-            <w:shd w:val="clear" w:fill="F2F4F7"/>
+            <w:tcW w:type="dxa" w:w="2700"/>
+            <w:shd w:fill="F2F4F7"/>
             <w:tcMar>
               <w:top w:w="70" w:type="dxa"/>
-              <w:left w:w="120" w:type="dxa"/>
+              <w:start w:w="120" w:type="dxa"/>
               <w:bottom w:w="70" w:type="dxa"/>
-              <w:right w:w="120" w:type="dxa"/>
+              <w:end w:w="120" w:type="dxa"/>
             </w:tcMar>
             <w:vAlign w:val="center"/>
           </w:tcPr>
@@ -248,12 +180,10 @@
             <w:r/>
             <w:r>
               <w:rPr>
-                <w:rFonts w:ascii="Calibri" w:hAnsi="Calibri" w:eastAsia="ＭＳ 明朝" w:cs="Calibri" w:eastAsiaTheme="minorEastAsia" w:csTheme="minorBidi"/>
+                <w:rFonts w:ascii="Calibri" w:hAnsi="Calibri"/>
                 <w:b/>
-                <w:bCs/>
                 <w:color w:val="1F4D78"/>
                 <w:sz w:val="15"/>
-                <w:szCs w:val="22"/>
               </w:rPr>
               <w:t>Original result</w:t>
             </w:r>
@@ -261,19 +191,13 @@
         </w:tc>
         <w:tc>
           <w:tcPr>
-            <w:tcW w:w="5480" w:type="dxa"/>
-            <w:tcBorders>
-              <w:top w:val="single" w:sz="4" w:space="0" w:color="auto"/>
-              <w:left w:val="single" w:sz="4" w:space="0" w:color="auto"/>
-              <w:bottom w:val="single" w:sz="4" w:space="0" w:color="auto"/>
-              <w:right w:val="single" w:sz="4" w:space="0" w:color="auto"/>
-            </w:tcBorders>
-            <w:shd w:val="clear" w:fill="F2F4F7"/>
+            <w:tcW w:type="dxa" w:w="5480"/>
+            <w:shd w:fill="F2F4F7"/>
             <w:tcMar>
               <w:top w:w="70" w:type="dxa"/>
-              <w:left w:w="120" w:type="dxa"/>
+              <w:start w:w="120" w:type="dxa"/>
               <w:bottom w:w="70" w:type="dxa"/>
-              <w:right w:w="120" w:type="dxa"/>
+              <w:end w:w="120" w:type="dxa"/>
             </w:tcMar>
             <w:vAlign w:val="center"/>
           </w:tcPr>
@@ -285,12 +209,10 @@
             <w:r/>
             <w:r>
               <w:rPr>
-                <w:rFonts w:ascii="Calibri" w:hAnsi="Calibri" w:eastAsia="ＭＳ 明朝" w:cs="Calibri" w:eastAsiaTheme="minorEastAsia" w:csTheme="minorBidi"/>
+                <w:rFonts w:ascii="Calibri" w:hAnsi="Calibri"/>
                 <w:b/>
-                <w:bCs/>
                 <w:color w:val="1F4D78"/>
                 <w:sz w:val="15"/>
-                <w:szCs w:val="22"/>
               </w:rPr>
               <w:t>StateBench outcome</w:t>
             </w:r>
@@ -303,18 +225,12 @@
         </w:trPr>
         <w:tc>
           <w:tcPr>
-            <w:tcW w:w="1900" w:type="dxa"/>
-            <w:tcBorders>
-              <w:top w:val="single" w:sz="4" w:space="0" w:color="auto"/>
-              <w:left w:val="single" w:sz="4" w:space="0" w:color="auto"/>
-              <w:bottom w:val="single" w:sz="4" w:space="0" w:color="auto"/>
-              <w:right w:val="single" w:sz="4" w:space="0" w:color="auto"/>
-            </w:tcBorders>
+            <w:tcW w:type="dxa" w:w="1900"/>
             <w:tcMar>
               <w:top w:w="70" w:type="dxa"/>
-              <w:left w:w="120" w:type="dxa"/>
+              <w:start w:w="120" w:type="dxa"/>
               <w:bottom w:w="70" w:type="dxa"/>
-              <w:right w:w="120" w:type="dxa"/>
+              <w:end w:w="120" w:type="dxa"/>
             </w:tcMar>
             <w:vAlign w:val="center"/>
           </w:tcPr>
@@ -325,10 +241,10 @@
             <w:r/>
             <w:r>
               <w:rPr>
-                <w:rFonts w:ascii="Calibri" w:hAnsi="Calibri" w:eastAsia="ＭＳ 明朝" w:cs="Calibri" w:eastAsiaTheme="minorEastAsia" w:csTheme="minorBidi"/>
+                <w:rFonts w:ascii="Calibri" w:hAnsi="Calibri"/>
+                <w:b w:val="0"/>
                 <w:color w:val="182535"/>
                 <w:sz w:val="15"/>
-                <w:szCs w:val="22"/>
               </w:rPr>
               <w:t>Dependency depth</w:t>
             </w:r>
@@ -336,18 +252,12 @@
         </w:tc>
         <w:tc>
           <w:tcPr>
-            <w:tcW w:w="2700" w:type="dxa"/>
-            <w:tcBorders>
-              <w:top w:val="single" w:sz="4" w:space="0" w:color="auto"/>
-              <w:left w:val="single" w:sz="4" w:space="0" w:color="auto"/>
-              <w:bottom w:val="single" w:sz="4" w:space="0" w:color="auto"/>
-              <w:right w:val="single" w:sz="4" w:space="0" w:color="auto"/>
-            </w:tcBorders>
+            <w:tcW w:type="dxa" w:w="2700"/>
             <w:tcMar>
               <w:top w:w="70" w:type="dxa"/>
-              <w:left w:w="120" w:type="dxa"/>
+              <w:start w:w="120" w:type="dxa"/>
               <w:bottom w:w="70" w:type="dxa"/>
-              <w:right w:w="120" w:type="dxa"/>
+              <w:end w:w="120" w:type="dxa"/>
             </w:tcMar>
             <w:vAlign w:val="center"/>
           </w:tcPr>
@@ -358,10 +268,10 @@
             <w:r/>
             <w:r>
               <w:rPr>
-                <w:rFonts w:ascii="Calibri" w:hAnsi="Calibri" w:eastAsia="ＭＳ 明朝" w:cs="Calibri" w:eastAsiaTheme="minorEastAsia" w:csTheme="minorBidi"/>
+                <w:rFonts w:ascii="Calibri" w:hAnsi="Calibri"/>
+                <w:b w:val="0"/>
                 <w:color w:val="182535"/>
                 <w:sz w:val="15"/>
-                <w:szCs w:val="22"/>
               </w:rPr>
               <w:t>Success falls as depth increases.</w:t>
             </w:r>
@@ -369,18 +279,12 @@
         </w:tc>
         <w:tc>
           <w:tcPr>
-            <w:tcW w:w="5480" w:type="dxa"/>
-            <w:tcBorders>
-              <w:top w:val="single" w:sz="4" w:space="0" w:color="auto"/>
-              <w:left w:val="single" w:sz="4" w:space="0" w:color="auto"/>
-              <w:bottom w:val="single" w:sz="4" w:space="0" w:color="auto"/>
-              <w:right w:val="single" w:sz="4" w:space="0" w:color="auto"/>
-            </w:tcBorders>
+            <w:tcW w:type="dxa" w:w="5480"/>
             <w:tcMar>
               <w:top w:w="70" w:type="dxa"/>
-              <w:left w:w="120" w:type="dxa"/>
+              <w:start w:w="120" w:type="dxa"/>
               <w:bottom w:w="70" w:type="dxa"/>
-              <w:right w:w="120" w:type="dxa"/>
+              <w:end w:w="120" w:type="dxa"/>
             </w:tcMar>
             <w:vAlign w:val="center"/>
           </w:tcPr>
@@ -391,10 +295,10 @@
             <w:r/>
             <w:r>
               <w:rPr>
-                <w:rFonts w:ascii="Calibri" w:hAnsi="Calibri" w:eastAsia="ＭＳ 明朝" w:cs="Calibri" w:eastAsiaTheme="minorEastAsia" w:csTheme="minorBidi"/>
+                <w:rFonts w:ascii="Calibri" w:hAnsi="Calibri"/>
+                <w:b w:val="0"/>
                 <w:color w:val="182535"/>
                 <w:sz w:val="15"/>
-                <w:szCs w:val="22"/>
               </w:rPr>
               <w:t>Paper-style calibration: easy 2/5, deep 0/5. Qualitatively reproduced.</w:t>
             </w:r>
@@ -407,18 +311,12 @@
         </w:trPr>
         <w:tc>
           <w:tcPr>
-            <w:tcW w:w="1900" w:type="dxa"/>
-            <w:tcBorders>
-              <w:top w:val="single" w:sz="4" w:space="0" w:color="auto"/>
-              <w:left w:val="single" w:sz="4" w:space="0" w:color="auto"/>
-              <w:bottom w:val="single" w:sz="4" w:space="0" w:color="auto"/>
-              <w:right w:val="single" w:sz="4" w:space="0" w:color="auto"/>
-            </w:tcBorders>
+            <w:tcW w:type="dxa" w:w="1900"/>
             <w:tcMar>
               <w:top w:w="70" w:type="dxa"/>
-              <w:left w:w="120" w:type="dxa"/>
+              <w:start w:w="120" w:type="dxa"/>
               <w:bottom w:w="70" w:type="dxa"/>
-              <w:right w:w="120" w:type="dxa"/>
+              <w:end w:w="120" w:type="dxa"/>
             </w:tcMar>
             <w:vAlign w:val="center"/>
           </w:tcPr>
@@ -429,10 +327,10 @@
             <w:r/>
             <w:r>
               <w:rPr>
-                <w:rFonts w:ascii="Calibri" w:hAnsi="Calibri" w:eastAsia="ＭＳ 明朝" w:cs="Calibri" w:eastAsiaTheme="minorEastAsia" w:csTheme="minorBidi"/>
+                <w:rFonts w:ascii="Calibri" w:hAnsi="Calibri"/>
+                <w:b w:val="0"/>
                 <w:color w:val="182535"/>
                 <w:sz w:val="15"/>
-                <w:szCs w:val="22"/>
               </w:rPr>
               <w:t>Connected distractors</w:t>
             </w:r>
@@ -440,18 +338,12 @@
         </w:tc>
         <w:tc>
           <w:tcPr>
-            <w:tcW w:w="2700" w:type="dxa"/>
-            <w:tcBorders>
-              <w:top w:val="single" w:sz="4" w:space="0" w:color="auto"/>
-              <w:left w:val="single" w:sz="4" w:space="0" w:color="auto"/>
-              <w:bottom w:val="single" w:sz="4" w:space="0" w:color="auto"/>
-              <w:right w:val="single" w:sz="4" w:space="0" w:color="auto"/>
-            </w:tcBorders>
+            <w:tcW w:type="dxa" w:w="2700"/>
             <w:tcMar>
               <w:top w:w="70" w:type="dxa"/>
-              <w:left w:w="120" w:type="dxa"/>
+              <w:start w:w="120" w:type="dxa"/>
               <w:bottom w:w="70" w:type="dxa"/>
-              <w:right w:w="120" w:type="dxa"/>
+              <w:end w:w="120" w:type="dxa"/>
             </w:tcMar>
             <w:vAlign w:val="center"/>
           </w:tcPr>
@@ -462,10 +354,10 @@
             <w:r/>
             <w:r>
               <w:rPr>
-                <w:rFonts w:ascii="Calibri" w:hAnsi="Calibri" w:eastAsia="ＭＳ 明朝" w:cs="Calibri" w:eastAsiaTheme="minorEastAsia" w:csTheme="minorBidi"/>
+                <w:rFonts w:ascii="Calibri" w:hAnsi="Calibri"/>
+                <w:b w:val="0"/>
                 <w:color w:val="182535"/>
                 <w:sz w:val="15"/>
-                <w:szCs w:val="22"/>
               </w:rPr>
               <w:t>CINs are more harmful than no-extra or disconnected settings.</w:t>
             </w:r>
@@ -473,18 +365,12 @@
         </w:tc>
         <w:tc>
           <w:tcPr>
-            <w:tcW w:w="5480" w:type="dxa"/>
-            <w:tcBorders>
-              <w:top w:val="single" w:sz="4" w:space="0" w:color="auto"/>
-              <w:left w:val="single" w:sz="4" w:space="0" w:color="auto"/>
-              <w:bottom w:val="single" w:sz="4" w:space="0" w:color="auto"/>
-              <w:right w:val="single" w:sz="4" w:space="0" w:color="auto"/>
-            </w:tcBorders>
+            <w:tcW w:type="dxa" w:w="5480"/>
             <w:tcMar>
               <w:top w:w="70" w:type="dxa"/>
-              <w:left w:w="120" w:type="dxa"/>
+              <w:start w:w="120" w:type="dxa"/>
               <w:bottom w:w="70" w:type="dxa"/>
-              <w:right w:w="120" w:type="dxa"/>
+              <w:end w:w="120" w:type="dxa"/>
             </w:tcMar>
             <w:vAlign w:val="center"/>
           </w:tcPr>
@@ -495,10 +381,10 @@
             <w:r/>
             <w:r>
               <w:rPr>
-                <w:rFonts w:ascii="Calibri" w:hAnsi="Calibri" w:eastAsia="ＭＳ 明朝" w:cs="Calibri" w:eastAsiaTheme="minorEastAsia" w:csTheme="minorBidi"/>
+                <w:rFonts w:ascii="Calibri" w:hAnsi="Calibri"/>
+                <w:b w:val="0"/>
                 <w:color w:val="182535"/>
                 <w:sz w:val="15"/>
-                <w:szCs w:val="22"/>
               </w:rPr>
               <w:t>Paper-style deep and connected both reached 0/5, so the incremental effect was not testable there. Under the compatible protocol, full history fell from 5/5 deep to 3/5 connected.</w:t>
             </w:r>
@@ -511,18 +397,12 @@
         </w:trPr>
         <w:tc>
           <w:tcPr>
-            <w:tcW w:w="1900" w:type="dxa"/>
-            <w:tcBorders>
-              <w:top w:val="single" w:sz="4" w:space="0" w:color="auto"/>
-              <w:left w:val="single" w:sz="4" w:space="0" w:color="auto"/>
-              <w:bottom w:val="single" w:sz="4" w:space="0" w:color="auto"/>
-              <w:right w:val="single" w:sz="4" w:space="0" w:color="auto"/>
-            </w:tcBorders>
+            <w:tcW w:type="dxa" w:w="1900"/>
             <w:tcMar>
               <w:top w:w="70" w:type="dxa"/>
-              <w:left w:w="120" w:type="dxa"/>
+              <w:start w:w="120" w:type="dxa"/>
               <w:bottom w:w="70" w:type="dxa"/>
-              <w:right w:w="120" w:type="dxa"/>
+              <w:end w:w="120" w:type="dxa"/>
             </w:tcMar>
             <w:vAlign w:val="center"/>
           </w:tcPr>
@@ -533,10 +413,10 @@
             <w:r/>
             <w:r>
               <w:rPr>
-                <w:rFonts w:ascii="Calibri" w:hAnsi="Calibri" w:eastAsia="ＭＳ 明朝" w:cs="Calibri" w:eastAsiaTheme="minorEastAsia" w:csTheme="minorBidi"/>
+                <w:rFonts w:ascii="Calibri" w:hAnsi="Calibri"/>
+                <w:b w:val="0"/>
                 <w:color w:val="182535"/>
                 <w:sz w:val="15"/>
-                <w:szCs w:val="22"/>
               </w:rPr>
               <w:t>State-tracking errors</w:t>
             </w:r>
@@ -544,18 +424,12 @@
         </w:tc>
         <w:tc>
           <w:tcPr>
-            <w:tcW w:w="2700" w:type="dxa"/>
-            <w:tcBorders>
-              <w:top w:val="single" w:sz="4" w:space="0" w:color="auto"/>
-              <w:left w:val="single" w:sz="4" w:space="0" w:color="auto"/>
-              <w:bottom w:val="single" w:sz="4" w:space="0" w:color="auto"/>
-              <w:right w:val="single" w:sz="4" w:space="0" w:color="auto"/>
-            </w:tcBorders>
+            <w:tcW w:type="dxa" w:w="2700"/>
             <w:tcMar>
               <w:top w:w="70" w:type="dxa"/>
-              <w:left w:w="120" w:type="dxa"/>
+              <w:start w:w="120" w:type="dxa"/>
               <w:bottom w:w="70" w:type="dxa"/>
-              <w:right w:w="120" w:type="dxa"/>
+              <w:end w:w="120" w:type="dxa"/>
             </w:tcMar>
             <w:vAlign w:val="center"/>
           </w:tcPr>
@@ -566,10 +440,10 @@
             <w:r/>
             <w:r>
               <w:rPr>
-                <w:rFonts w:ascii="Calibri" w:hAnsi="Calibri" w:eastAsia="ＭＳ 明朝" w:cs="Calibri" w:eastAsiaTheme="minorEastAsia" w:csTheme="minorBidi"/>
+                <w:rFonts w:ascii="Calibri" w:hAnsi="Calibri"/>
+                <w:b w:val="0"/>
                 <w:color w:val="182535"/>
                 <w:sz w:val="15"/>
-                <w:szCs w:val="22"/>
               </w:rPr>
               <w:t>Using values not yet known is the most common error family.</w:t>
             </w:r>
@@ -577,18 +451,12 @@
         </w:tc>
         <w:tc>
           <w:tcPr>
-            <w:tcW w:w="5480" w:type="dxa"/>
-            <w:tcBorders>
-              <w:top w:val="single" w:sz="4" w:space="0" w:color="auto"/>
-              <w:left w:val="single" w:sz="4" w:space="0" w:color="auto"/>
-              <w:bottom w:val="single" w:sz="4" w:space="0" w:color="auto"/>
-              <w:right w:val="single" w:sz="4" w:space="0" w:color="auto"/>
-            </w:tcBorders>
+            <w:tcW w:type="dxa" w:w="5480"/>
             <w:tcMar>
               <w:top w:w="70" w:type="dxa"/>
-              <w:left w:w="120" w:type="dxa"/>
+              <w:start w:w="120" w:type="dxa"/>
               <w:bottom w:w="70" w:type="dxa"/>
-              <w:right w:w="120" w:type="dxa"/>
+              <w:end w:w="120" w:type="dxa"/>
             </w:tcMar>
             <w:vAlign w:val="center"/>
           </w:tcPr>
@@ -599,10 +467,10 @@
             <w:r/>
             <w:r>
               <w:rPr>
-                <w:rFonts w:ascii="Calibri" w:hAnsi="Calibri" w:eastAsia="ＭＳ 明朝" w:cs="Calibri" w:eastAsiaTheme="minorEastAsia" w:csTheme="minorBidi"/>
+                <w:rFonts w:ascii="Calibri" w:hAnsi="Calibri"/>
+                <w:b w:val="0"/>
                 <w:color w:val="182535"/>
                 <w:sz w:val="15"/>
-                <w:szCs w:val="22"/>
               </w:rPr>
               <w:t>Sixteen value-not-yet-known events occurred across final traces; explicit errors allowed several runs to recover.</w:t>
             </w:r>
@@ -615,18 +483,12 @@
         </w:trPr>
         <w:tc>
           <w:tcPr>
-            <w:tcW w:w="1900" w:type="dxa"/>
-            <w:tcBorders>
-              <w:top w:val="single" w:sz="4" w:space="0" w:color="auto"/>
-              <w:left w:val="single" w:sz="4" w:space="0" w:color="auto"/>
-              <w:bottom w:val="single" w:sz="4" w:space="0" w:color="auto"/>
-              <w:right w:val="single" w:sz="4" w:space="0" w:color="auto"/>
-            </w:tcBorders>
+            <w:tcW w:type="dxa" w:w="1900"/>
             <w:tcMar>
               <w:top w:w="70" w:type="dxa"/>
-              <w:left w:w="120" w:type="dxa"/>
+              <w:start w:w="120" w:type="dxa"/>
               <w:bottom w:w="70" w:type="dxa"/>
-              <w:right w:w="120" w:type="dxa"/>
+              <w:end w:w="120" w:type="dxa"/>
             </w:tcMar>
             <w:vAlign w:val="center"/>
           </w:tcPr>
@@ -637,10 +499,10 @@
             <w:r/>
             <w:r>
               <w:rPr>
-                <w:rFonts w:ascii="Calibri" w:hAnsi="Calibri" w:eastAsia="ＭＳ 明朝" w:cs="Calibri" w:eastAsiaTheme="minorEastAsia" w:csTheme="minorBidi"/>
+                <w:rFonts w:ascii="Calibri" w:hAnsi="Calibri"/>
+                <w:b w:val="0"/>
                 <w:color w:val="182535"/>
                 <w:sz w:val="15"/>
-                <w:szCs w:val="22"/>
               </w:rPr>
               <w:t>Known-value restatement</w:t>
             </w:r>
@@ -648,18 +510,12 @@
         </w:tc>
         <w:tc>
           <w:tcPr>
-            <w:tcW w:w="2700" w:type="dxa"/>
-            <w:tcBorders>
-              <w:top w:val="single" w:sz="4" w:space="0" w:color="auto"/>
-              <w:left w:val="single" w:sz="4" w:space="0" w:color="auto"/>
-              <w:bottom w:val="single" w:sz="4" w:space="0" w:color="auto"/>
-              <w:right w:val="single" w:sz="4" w:space="0" w:color="auto"/>
-            </w:tcBorders>
+            <w:tcW w:type="dxa" w:w="2700"/>
             <w:tcMar>
               <w:top w:w="70" w:type="dxa"/>
-              <w:left w:w="120" w:type="dxa"/>
+              <w:start w:w="120" w:type="dxa"/>
               <w:bottom w:w="70" w:type="dxa"/>
-              <w:right w:w="120" w:type="dxa"/>
+              <w:end w:w="120" w:type="dxa"/>
             </w:tcMar>
             <w:vAlign w:val="center"/>
           </w:tcPr>
@@ -670,10 +526,10 @@
             <w:r/>
             <w:r>
               <w:rPr>
-                <w:rFonts w:ascii="Calibri" w:hAnsi="Calibri" w:eastAsia="ＭＳ 明朝" w:cs="Calibri" w:eastAsiaTheme="minorEastAsia" w:csTheme="minorBidi"/>
+                <w:rFonts w:ascii="Calibri" w:hAnsi="Calibri"/>
+                <w:b w:val="0"/>
                 <w:color w:val="182535"/>
                 <w:sz w:val="15"/>
-                <w:szCs w:val="22"/>
               </w:rPr>
               <w:t>Restating all known values often improves reliability, although gains vary by model.</w:t>
             </w:r>
@@ -681,18 +537,12 @@
         </w:tc>
         <w:tc>
           <w:tcPr>
-            <w:tcW w:w="5480" w:type="dxa"/>
-            <w:tcBorders>
-              <w:top w:val="single" w:sz="4" w:space="0" w:color="auto"/>
-              <w:left w:val="single" w:sz="4" w:space="0" w:color="auto"/>
-              <w:bottom w:val="single" w:sz="4" w:space="0" w:color="auto"/>
-              <w:right w:val="single" w:sz="4" w:space="0" w:color="auto"/>
-            </w:tcBorders>
+            <w:tcW w:type="dxa" w:w="5480"/>
             <w:tcMar>
               <w:top w:w="70" w:type="dxa"/>
-              <w:left w:w="120" w:type="dxa"/>
+              <w:start w:w="120" w:type="dxa"/>
               <w:bottom w:w="70" w:type="dxa"/>
-              <w:right w:w="120" w:type="dxa"/>
+              <w:end w:w="120" w:type="dxa"/>
             </w:tcMar>
             <w:vAlign w:val="center"/>
           </w:tcPr>
@@ -703,10 +553,10 @@
             <w:r/>
             <w:r>
               <w:rPr>
-                <w:rFonts w:ascii="Calibri" w:hAnsi="Calibri" w:eastAsia="ＭＳ 明朝" w:cs="Calibri" w:eastAsiaTheme="minorEastAsia" w:csTheme="minorBidi"/>
+                <w:rFonts w:ascii="Calibri" w:hAnsi="Calibri"/>
+                <w:b w:val="0"/>
                 <w:color w:val="182535"/>
                 <w:sz w:val="15"/>
-                <w:szCs w:val="22"/>
               </w:rPr>
               <w:t>Restatement improved only from 12/15 to 13/15 and stayed 3/5 on connected tasks. This is a qualified, not large, reproduction of the mitigation effect.</w:t>
             </w:r>
@@ -720,26 +570,15 @@
         <w:jc w:val="center"/>
       </w:pPr>
       <w:r>
-        <w:rPr>
-          <w:rFonts w:ascii="Calibri" w:hAnsi="Calibri" w:eastAsia="ＭＳ 明朝" w:cs="Calibri" w:eastAsiaTheme="minorEastAsia" w:csTheme="minorBidi"/>
-          <w:b/>
-          <w:bCs/>
-          <w:i/>
-          <w:iCs/>
-          <w:color w:val="56606C"/>
-          <w:sz w:val="15"/>
-          <w:szCs w:val="18"/>
-        </w:rPr>
         <w:t>Table 1. Relationship between the published findings and this representative reproduction.</w:t>
       </w:r>
     </w:p>
     <w:p>
       <w:pPr>
-        <w:pageBreakBefore/>
         <w:spacing w:after="0"/>
       </w:pPr>
       <w:r>
-        <w:lastRenderedPageBreak/>
+        <w:br w:type="page"/>
       </w:r>
     </w:p>
     <w:p>
@@ -747,14 +586,6 @@
         <w:pStyle w:val="Heading1"/>
       </w:pPr>
       <w:r>
-        <w:rPr>
-          <w:rFonts w:ascii="Calibri" w:hAnsi="Calibri" w:eastAsia="ＭＳ ゴシック" w:cs="Calibri" w:asciiTheme="majorHAnsi" w:hAnsiTheme="majorHAnsi" w:eastAsiaTheme="majorEastAsia" w:csTheme="majorBidi"/>
-          <w:b/>
-          <w:bCs/>
-          <w:color w:val="2E74B5"/>
-          <w:sz w:val="24"/>
-          <w:szCs w:val="28"/>
-        </w:rPr>
         <w:t>3. Methodology (Approach / Reproduction Details)</w:t>
       </w:r>
     </w:p>
@@ -765,10 +596,11 @@
       </w:pPr>
       <w:r>
         <w:rPr>
-          <w:rFonts w:ascii="Calibri" w:hAnsi="Calibri" w:eastAsia="ＭＳ 明朝" w:cs="Calibri" w:eastAsiaTheme="minorEastAsia" w:csTheme="minorBidi"/>
+          <w:rFonts w:ascii="Calibri" w:hAnsi="Calibri"/>
+          <w:b w:val="0"/>
+          <w:i w:val="0"/>
           <w:color w:val="182535"/>
           <w:sz w:val="20"/>
-          <w:szCs w:val="22"/>
         </w:rPr>
         <w:t>Reproduction foundation. The project vendors the official FuncBenchGen code release at commit 0718d1cf25b601d0b25fbbbbd064525536cea876. It preserves graph generation, hidden dependencies, type/subtype matching, deterministic target values, exact-answer evaluation, five graph seeds per setting, randomized function order, and the paper's maximum call budget of twice the minimum required calls. No external static dataset is used: graphs are generated synthetically and then frozen so every state strategy receives the identical graph, functions, initial values, target, and tool ordering.</w:t>
       </w:r>
@@ -780,10 +612,11 @@
       </w:pPr>
       <w:r>
         <w:rPr>
-          <w:rFonts w:ascii="Calibri" w:hAnsi="Calibri" w:eastAsia="ＭＳ 明朝" w:cs="Calibri" w:eastAsiaTheme="minorEastAsia" w:csTheme="minorBidi"/>
+          <w:rFonts w:ascii="Calibri" w:hAnsi="Calibri"/>
+          <w:b w:val="0"/>
+          <w:i w:val="0"/>
           <w:color w:val="182535"/>
           <w:sz w:val="20"/>
-          <w:szCs w:val="22"/>
         </w:rPr>
         <w:t>The paper-style calibration used opaque descriptions and the upstream behavior in which wrong inputs execute and return an incorrect value. With full history, Qwen3.6-27B achieved 2/5 on easy depth, 0/5 on deep depth, and 0/5 with connected distractors. This reproduces the qualitative depth decline, but the zero deep baseline prevents a faithful estimate of CINs' additional effect. It is therefore reported separately from the final extension rather than mixed with it.</w:t>
       </w:r>
@@ -795,10 +628,11 @@
       </w:pPr>
       <w:r>
         <w:rPr>
-          <w:rFonts w:ascii="Calibri" w:hAnsi="Calibri" w:eastAsia="ＭＳ 明朝" w:cs="Calibri" w:eastAsiaTheme="minorEastAsia" w:csTheme="minorBidi"/>
+          <w:rFonts w:ascii="Calibri" w:hAnsi="Calibri"/>
+          <w:b w:val="0"/>
+          <w:i w:val="0"/>
           <w:color w:val="182535"/>
           <w:sz w:val="20"/>
-          <w:szCs w:val="22"/>
         </w:rPr>
         <w:t>For the controlled extension, every strategy used the same model-compatible interface: descriptions exposed variable names, premature calls returned an explicit error, the model made one tool call per response, and it was instructed to use only observed values. The hidden DAG, target path, ground-truth values, correctness labels, and unobserved state remained unavailable. Qwen3.6-27B was accessed through Groq with temperature 0, top-p 1, default reasoning enabled, a 4,096-token completion allowance, and the same two-times-minimum call budget.</w:t>
       </w:r>
@@ -806,25 +640,11 @@
     <w:tbl>
       <w:tblPr>
         <w:tblStyle w:val="TableGrid"/>
-        <w:tblW w:w="10080" w:type="dxa"/>
+        <w:tblW w:type="dxa" w:w="10080"/>
         <w:jc w:val="left"/>
+        <w:tblLook w:firstColumn="1" w:firstRow="1" w:lastColumn="0" w:lastRow="0" w:noHBand="0" w:noVBand="1" w:val="04A0"/>
         <w:tblInd w:w="120" w:type="dxa"/>
-        <w:tblBorders>
-          <w:top w:val="single" w:sz="4" w:space="0" w:color="auto"/>
-          <w:left w:val="single" w:sz="4" w:space="0" w:color="auto"/>
-          <w:bottom w:val="single" w:sz="4" w:space="0" w:color="auto"/>
-          <w:right w:val="single" w:sz="4" w:space="0" w:color="auto"/>
-          <w:insideH w:val="single" w:sz="4" w:space="0" w:color="auto"/>
-          <w:insideV w:val="single" w:sz="4" w:space="0" w:color="auto"/>
-        </w:tblBorders>
         <w:tblLayout w:type="fixed"/>
-        <w:tblCellMar>
-          <w:top w:w="0" w:type="dxa"/>
-          <w:left w:w="108" w:type="dxa"/>
-          <w:bottom w:w="0" w:type="dxa"/>
-          <w:right w:w="108" w:type="dxa"/>
-        </w:tblCellMar>
-        <w:tblLook w:firstRow="1" w:firstColumn="1" w:noVBand="1"/>
       </w:tblPr>
       <w:tblGrid>
         <w:gridCol w:w="2050"/>
@@ -835,24 +655,18 @@
       </w:tblGrid>
       <w:tr>
         <w:trPr>
+          <w:tblHeader w:val="true"/>
           <w:cantSplit/>
-          <w:tblHeader/>
         </w:trPr>
         <w:tc>
           <w:tcPr>
-            <w:tcW w:w="2050" w:type="dxa"/>
-            <w:tcBorders>
-              <w:top w:val="single" w:sz="4" w:space="0" w:color="auto"/>
-              <w:left w:val="single" w:sz="4" w:space="0" w:color="auto"/>
-              <w:bottom w:val="single" w:sz="4" w:space="0" w:color="auto"/>
-              <w:right w:val="single" w:sz="4" w:space="0" w:color="auto"/>
-            </w:tcBorders>
-            <w:shd w:val="clear" w:fill="F2F4F7"/>
+            <w:tcW w:type="dxa" w:w="2050"/>
+            <w:shd w:fill="F2F4F7"/>
             <w:tcMar>
               <w:top w:w="70" w:type="dxa"/>
-              <w:left w:w="120" w:type="dxa"/>
+              <w:start w:w="120" w:type="dxa"/>
               <w:bottom w:w="70" w:type="dxa"/>
-              <w:right w:w="120" w:type="dxa"/>
+              <w:end w:w="120" w:type="dxa"/>
             </w:tcMar>
             <w:vAlign w:val="center"/>
           </w:tcPr>
@@ -864,12 +678,10 @@
             <w:r/>
             <w:r>
               <w:rPr>
-                <w:rFonts w:ascii="Calibri" w:hAnsi="Calibri" w:eastAsia="ＭＳ 明朝" w:cs="Calibri" w:eastAsiaTheme="minorEastAsia" w:csTheme="minorBidi"/>
+                <w:rFonts w:ascii="Calibri" w:hAnsi="Calibri"/>
                 <w:b/>
-                <w:bCs/>
                 <w:color w:val="1F4D78"/>
                 <w:sz w:val="15"/>
-                <w:szCs w:val="22"/>
               </w:rPr>
               <w:t>Condition</w:t>
             </w:r>
@@ -877,19 +689,13 @@
         </w:tc>
         <w:tc>
           <w:tcPr>
-            <w:tcW w:w="750" w:type="dxa"/>
-            <w:tcBorders>
-              <w:top w:val="single" w:sz="4" w:space="0" w:color="auto"/>
-              <w:left w:val="single" w:sz="4" w:space="0" w:color="auto"/>
-              <w:bottom w:val="single" w:sz="4" w:space="0" w:color="auto"/>
-              <w:right w:val="single" w:sz="4" w:space="0" w:color="auto"/>
-            </w:tcBorders>
-            <w:shd w:val="clear" w:fill="F2F4F7"/>
+            <w:tcW w:type="dxa" w:w="750"/>
+            <w:shd w:fill="F2F4F7"/>
             <w:tcMar>
               <w:top w:w="70" w:type="dxa"/>
-              <w:left w:w="120" w:type="dxa"/>
+              <w:start w:w="120" w:type="dxa"/>
               <w:bottom w:w="70" w:type="dxa"/>
-              <w:right w:w="120" w:type="dxa"/>
+              <w:end w:w="120" w:type="dxa"/>
             </w:tcMar>
             <w:vAlign w:val="center"/>
           </w:tcPr>
@@ -901,12 +707,10 @@
             <w:r/>
             <w:r>
               <w:rPr>
-                <w:rFonts w:ascii="Calibri" w:hAnsi="Calibri" w:eastAsia="ＭＳ 明朝" w:cs="Calibri" w:eastAsiaTheme="minorEastAsia" w:csTheme="minorBidi"/>
+                <w:rFonts w:ascii="Calibri" w:hAnsi="Calibri"/>
                 <w:b/>
-                <w:bCs/>
                 <w:color w:val="1F4D78"/>
                 <w:sz w:val="15"/>
-                <w:szCs w:val="22"/>
               </w:rPr>
               <w:t>Core</w:t>
             </w:r>
@@ -914,19 +718,13 @@
         </w:tc>
         <w:tc>
           <w:tcPr>
-            <w:tcW w:w="850" w:type="dxa"/>
-            <w:tcBorders>
-              <w:top w:val="single" w:sz="4" w:space="0" w:color="auto"/>
-              <w:left w:val="single" w:sz="4" w:space="0" w:color="auto"/>
-              <w:bottom w:val="single" w:sz="4" w:space="0" w:color="auto"/>
-              <w:right w:val="single" w:sz="4" w:space="0" w:color="auto"/>
-            </w:tcBorders>
-            <w:shd w:val="clear" w:fill="F2F4F7"/>
+            <w:tcW w:type="dxa" w:w="850"/>
+            <w:shd w:fill="F2F4F7"/>
             <w:tcMar>
               <w:top w:w="70" w:type="dxa"/>
-              <w:left w:w="120" w:type="dxa"/>
+              <w:start w:w="120" w:type="dxa"/>
               <w:bottom w:w="70" w:type="dxa"/>
-              <w:right w:w="120" w:type="dxa"/>
+              <w:end w:w="120" w:type="dxa"/>
             </w:tcMar>
             <w:vAlign w:val="center"/>
           </w:tcPr>
@@ -938,12 +736,10 @@
             <w:r/>
             <w:r>
               <w:rPr>
-                <w:rFonts w:ascii="Calibri" w:hAnsi="Calibri" w:eastAsia="ＭＳ 明朝" w:cs="Calibri" w:eastAsiaTheme="minorEastAsia" w:csTheme="minorBidi"/>
+                <w:rFonts w:ascii="Calibri" w:hAnsi="Calibri"/>
                 <w:b/>
-                <w:bCs/>
                 <w:color w:val="1F4D78"/>
                 <w:sz w:val="15"/>
-                <w:szCs w:val="22"/>
               </w:rPr>
               <w:t>Depth</w:t>
             </w:r>
@@ -951,19 +747,13 @@
         </w:tc>
         <w:tc>
           <w:tcPr>
-            <w:tcW w:w="1450" w:type="dxa"/>
-            <w:tcBorders>
-              <w:top w:val="single" w:sz="4" w:space="0" w:color="auto"/>
-              <w:left w:val="single" w:sz="4" w:space="0" w:color="auto"/>
-              <w:bottom w:val="single" w:sz="4" w:space="0" w:color="auto"/>
-              <w:right w:val="single" w:sz="4" w:space="0" w:color="auto"/>
-            </w:tcBorders>
-            <w:shd w:val="clear" w:fill="F2F4F7"/>
+            <w:tcW w:type="dxa" w:w="1450"/>
+            <w:shd w:fill="F2F4F7"/>
             <w:tcMar>
               <w:top w:w="70" w:type="dxa"/>
-              <w:left w:w="120" w:type="dxa"/>
+              <w:start w:w="120" w:type="dxa"/>
               <w:bottom w:w="70" w:type="dxa"/>
-              <w:right w:w="120" w:type="dxa"/>
+              <w:end w:w="120" w:type="dxa"/>
             </w:tcMar>
             <w:vAlign w:val="center"/>
           </w:tcPr>
@@ -975,12 +765,10 @@
             <w:r/>
             <w:r>
               <w:rPr>
-                <w:rFonts w:ascii="Calibri" w:hAnsi="Calibri" w:eastAsia="ＭＳ 明朝" w:cs="Calibri" w:eastAsiaTheme="minorEastAsia" w:csTheme="minorBidi"/>
+                <w:rFonts w:ascii="Calibri" w:hAnsi="Calibri"/>
                 <w:b/>
-                <w:bCs/>
                 <w:color w:val="1F4D78"/>
                 <w:sz w:val="15"/>
-                <w:szCs w:val="22"/>
               </w:rPr>
               <w:t>Distractors</w:t>
             </w:r>
@@ -988,19 +776,13 @@
         </w:tc>
         <w:tc>
           <w:tcPr>
-            <w:tcW w:w="4980" w:type="dxa"/>
-            <w:tcBorders>
-              <w:top w:val="single" w:sz="4" w:space="0" w:color="auto"/>
-              <w:left w:val="single" w:sz="4" w:space="0" w:color="auto"/>
-              <w:bottom w:val="single" w:sz="4" w:space="0" w:color="auto"/>
-              <w:right w:val="single" w:sz="4" w:space="0" w:color="auto"/>
-            </w:tcBorders>
-            <w:shd w:val="clear" w:fill="F2F4F7"/>
+            <w:tcW w:type="dxa" w:w="4980"/>
+            <w:shd w:fill="F2F4F7"/>
             <w:tcMar>
               <w:top w:w="70" w:type="dxa"/>
-              <w:left w:w="120" w:type="dxa"/>
+              <w:start w:w="120" w:type="dxa"/>
               <w:bottom w:w="70" w:type="dxa"/>
-              <w:right w:w="120" w:type="dxa"/>
+              <w:end w:w="120" w:type="dxa"/>
             </w:tcMar>
             <w:vAlign w:val="center"/>
           </w:tcPr>
@@ -1012,12 +794,10 @@
             <w:r/>
             <w:r>
               <w:rPr>
-                <w:rFonts w:ascii="Calibri" w:hAnsi="Calibri" w:eastAsia="ＭＳ 明朝" w:cs="Calibri" w:eastAsiaTheme="minorEastAsia" w:csTheme="minorBidi"/>
+                <w:rFonts w:ascii="Calibri" w:hAnsi="Calibri"/>
                 <w:b/>
-                <w:bCs/>
                 <w:color w:val="1F4D78"/>
                 <w:sz w:val="15"/>
-                <w:szCs w:val="22"/>
               </w:rPr>
               <w:t>Purpose</w:t>
             </w:r>
@@ -1030,18 +810,12 @@
         </w:trPr>
         <w:tc>
           <w:tcPr>
-            <w:tcW w:w="2050" w:type="dxa"/>
-            <w:tcBorders>
-              <w:top w:val="single" w:sz="4" w:space="0" w:color="auto"/>
-              <w:left w:val="single" w:sz="4" w:space="0" w:color="auto"/>
-              <w:bottom w:val="single" w:sz="4" w:space="0" w:color="auto"/>
-              <w:right w:val="single" w:sz="4" w:space="0" w:color="auto"/>
-            </w:tcBorders>
+            <w:tcW w:type="dxa" w:w="2050"/>
             <w:tcMar>
               <w:top w:w="70" w:type="dxa"/>
-              <w:left w:w="120" w:type="dxa"/>
+              <w:start w:w="120" w:type="dxa"/>
               <w:bottom w:w="70" w:type="dxa"/>
-              <w:right w:w="120" w:type="dxa"/>
+              <w:end w:w="120" w:type="dxa"/>
             </w:tcMar>
             <w:vAlign w:val="center"/>
           </w:tcPr>
@@ -1053,10 +827,10 @@
             <w:r/>
             <w:r>
               <w:rPr>
-                <w:rFonts w:ascii="Calibri" w:hAnsi="Calibri" w:eastAsia="ＭＳ 明朝" w:cs="Calibri" w:eastAsiaTheme="minorEastAsia" w:csTheme="minorBidi"/>
+                <w:rFonts w:ascii="Calibri" w:hAnsi="Calibri"/>
+                <w:b w:val="0"/>
                 <w:color w:val="182535"/>
                 <w:sz w:val="15"/>
-                <w:szCs w:val="22"/>
               </w:rPr>
               <w:t>Easy</w:t>
             </w:r>
@@ -1064,18 +838,12 @@
         </w:tc>
         <w:tc>
           <w:tcPr>
-            <w:tcW w:w="750" w:type="dxa"/>
-            <w:tcBorders>
-              <w:top w:val="single" w:sz="4" w:space="0" w:color="auto"/>
-              <w:left w:val="single" w:sz="4" w:space="0" w:color="auto"/>
-              <w:bottom w:val="single" w:sz="4" w:space="0" w:color="auto"/>
-              <w:right w:val="single" w:sz="4" w:space="0" w:color="auto"/>
-            </w:tcBorders>
+            <w:tcW w:type="dxa" w:w="750"/>
             <w:tcMar>
               <w:top w:w="70" w:type="dxa"/>
-              <w:left w:w="120" w:type="dxa"/>
+              <w:start w:w="120" w:type="dxa"/>
               <w:bottom w:w="70" w:type="dxa"/>
-              <w:right w:w="120" w:type="dxa"/>
+              <w:end w:w="120" w:type="dxa"/>
             </w:tcMar>
             <w:vAlign w:val="center"/>
           </w:tcPr>
@@ -1087,10 +855,10 @@
             <w:r/>
             <w:r>
               <w:rPr>
-                <w:rFonts w:ascii="Calibri" w:hAnsi="Calibri" w:eastAsia="ＭＳ 明朝" w:cs="Calibri" w:eastAsiaTheme="minorEastAsia" w:csTheme="minorBidi"/>
+                <w:rFonts w:ascii="Calibri" w:hAnsi="Calibri"/>
+                <w:b w:val="0"/>
                 <w:color w:val="182535"/>
                 <w:sz w:val="15"/>
-                <w:szCs w:val="22"/>
               </w:rPr>
               <w:t>5</w:t>
             </w:r>
@@ -1098,18 +866,12 @@
         </w:tc>
         <w:tc>
           <w:tcPr>
-            <w:tcW w:w="850" w:type="dxa"/>
-            <w:tcBorders>
-              <w:top w:val="single" w:sz="4" w:space="0" w:color="auto"/>
-              <w:left w:val="single" w:sz="4" w:space="0" w:color="auto"/>
-              <w:bottom w:val="single" w:sz="4" w:space="0" w:color="auto"/>
-              <w:right w:val="single" w:sz="4" w:space="0" w:color="auto"/>
-            </w:tcBorders>
+            <w:tcW w:type="dxa" w:w="850"/>
             <w:tcMar>
               <w:top w:w="70" w:type="dxa"/>
-              <w:left w:w="120" w:type="dxa"/>
+              <w:start w:w="120" w:type="dxa"/>
               <w:bottom w:w="70" w:type="dxa"/>
-              <w:right w:w="120" w:type="dxa"/>
+              <w:end w:w="120" w:type="dxa"/>
             </w:tcMar>
             <w:vAlign w:val="center"/>
           </w:tcPr>
@@ -1121,10 +883,10 @@
             <w:r/>
             <w:r>
               <w:rPr>
-                <w:rFonts w:ascii="Calibri" w:hAnsi="Calibri" w:eastAsia="ＭＳ 明朝" w:cs="Calibri" w:eastAsiaTheme="minorEastAsia" w:csTheme="minorBidi"/>
+                <w:rFonts w:ascii="Calibri" w:hAnsi="Calibri"/>
+                <w:b w:val="0"/>
                 <w:color w:val="182535"/>
                 <w:sz w:val="15"/>
-                <w:szCs w:val="22"/>
               </w:rPr>
               <w:t>1</w:t>
             </w:r>
@@ -1132,18 +894,12 @@
         </w:tc>
         <w:tc>
           <w:tcPr>
-            <w:tcW w:w="1450" w:type="dxa"/>
-            <w:tcBorders>
-              <w:top w:val="single" w:sz="4" w:space="0" w:color="auto"/>
-              <w:left w:val="single" w:sz="4" w:space="0" w:color="auto"/>
-              <w:bottom w:val="single" w:sz="4" w:space="0" w:color="auto"/>
-              <w:right w:val="single" w:sz="4" w:space="0" w:color="auto"/>
-            </w:tcBorders>
+            <w:tcW w:type="dxa" w:w="1450"/>
             <w:tcMar>
               <w:top w:w="70" w:type="dxa"/>
-              <w:left w:w="120" w:type="dxa"/>
+              <w:start w:w="120" w:type="dxa"/>
               <w:bottom w:w="70" w:type="dxa"/>
-              <w:right w:w="120" w:type="dxa"/>
+              <w:end w:w="120" w:type="dxa"/>
             </w:tcMar>
             <w:vAlign w:val="center"/>
           </w:tcPr>
@@ -1155,10 +911,10 @@
             <w:r/>
             <w:r>
               <w:rPr>
-                <w:rFonts w:ascii="Calibri" w:hAnsi="Calibri" w:eastAsia="ＭＳ 明朝" w:cs="Calibri" w:eastAsiaTheme="minorEastAsia" w:csTheme="minorBidi"/>
+                <w:rFonts w:ascii="Calibri" w:hAnsi="Calibri"/>
+                <w:b w:val="0"/>
                 <w:color w:val="182535"/>
                 <w:sz w:val="15"/>
-                <w:szCs w:val="22"/>
               </w:rPr>
               <w:t>0</w:t>
             </w:r>
@@ -1166,18 +922,12 @@
         </w:tc>
         <w:tc>
           <w:tcPr>
-            <w:tcW w:w="4980" w:type="dxa"/>
-            <w:tcBorders>
-              <w:top w:val="single" w:sz="4" w:space="0" w:color="auto"/>
-              <w:left w:val="single" w:sz="4" w:space="0" w:color="auto"/>
-              <w:bottom w:val="single" w:sz="4" w:space="0" w:color="auto"/>
-              <w:right w:val="single" w:sz="4" w:space="0" w:color="auto"/>
-            </w:tcBorders>
+            <w:tcW w:type="dxa" w:w="4980"/>
             <w:tcMar>
               <w:top w:w="70" w:type="dxa"/>
-              <w:left w:w="120" w:type="dxa"/>
+              <w:start w:w="120" w:type="dxa"/>
               <w:bottom w:w="70" w:type="dxa"/>
-              <w:right w:w="120" w:type="dxa"/>
+              <w:end w:w="120" w:type="dxa"/>
             </w:tcMar>
             <w:vAlign w:val="center"/>
           </w:tcPr>
@@ -1189,10 +939,10 @@
             <w:r/>
             <w:r>
               <w:rPr>
-                <w:rFonts w:ascii="Calibri" w:hAnsi="Calibri" w:eastAsia="ＭＳ 明朝" w:cs="Calibri" w:eastAsiaTheme="minorEastAsia" w:csTheme="minorBidi"/>
+                <w:rFonts w:ascii="Calibri" w:hAnsi="Calibri"/>
+                <w:b w:val="0"/>
                 <w:color w:val="182535"/>
                 <w:sz w:val="15"/>
-                <w:szCs w:val="22"/>
               </w:rPr>
               <w:t>Basic tool selection and value propagation</w:t>
             </w:r>
@@ -1205,18 +955,12 @@
         </w:trPr>
         <w:tc>
           <w:tcPr>
-            <w:tcW w:w="2050" w:type="dxa"/>
-            <w:tcBorders>
-              <w:top w:val="single" w:sz="4" w:space="0" w:color="auto"/>
-              <w:left w:val="single" w:sz="4" w:space="0" w:color="auto"/>
-              <w:bottom w:val="single" w:sz="4" w:space="0" w:color="auto"/>
-              <w:right w:val="single" w:sz="4" w:space="0" w:color="auto"/>
-            </w:tcBorders>
+            <w:tcW w:type="dxa" w:w="2050"/>
             <w:tcMar>
               <w:top w:w="70" w:type="dxa"/>
-              <w:left w:w="120" w:type="dxa"/>
+              <w:start w:w="120" w:type="dxa"/>
               <w:bottom w:w="70" w:type="dxa"/>
-              <w:right w:w="120" w:type="dxa"/>
+              <w:end w:w="120" w:type="dxa"/>
             </w:tcMar>
             <w:vAlign w:val="center"/>
           </w:tcPr>
@@ -1228,10 +972,10 @@
             <w:r/>
             <w:r>
               <w:rPr>
-                <w:rFonts w:ascii="Calibri" w:hAnsi="Calibri" w:eastAsia="ＭＳ 明朝" w:cs="Calibri" w:eastAsiaTheme="minorEastAsia" w:csTheme="minorBidi"/>
+                <w:rFonts w:ascii="Calibri" w:hAnsi="Calibri"/>
+                <w:b w:val="0"/>
                 <w:color w:val="182535"/>
                 <w:sz w:val="15"/>
-                <w:szCs w:val="22"/>
               </w:rPr>
               <w:t>Deep</w:t>
             </w:r>
@@ -1239,18 +983,12 @@
         </w:tc>
         <w:tc>
           <w:tcPr>
-            <w:tcW w:w="750" w:type="dxa"/>
-            <w:tcBorders>
-              <w:top w:val="single" w:sz="4" w:space="0" w:color="auto"/>
-              <w:left w:val="single" w:sz="4" w:space="0" w:color="auto"/>
-              <w:bottom w:val="single" w:sz="4" w:space="0" w:color="auto"/>
-              <w:right w:val="single" w:sz="4" w:space="0" w:color="auto"/>
-            </w:tcBorders>
+            <w:tcW w:type="dxa" w:w="750"/>
             <w:tcMar>
               <w:top w:w="70" w:type="dxa"/>
-              <w:left w:w="120" w:type="dxa"/>
+              <w:start w:w="120" w:type="dxa"/>
               <w:bottom w:w="70" w:type="dxa"/>
-              <w:right w:w="120" w:type="dxa"/>
+              <w:end w:w="120" w:type="dxa"/>
             </w:tcMar>
             <w:vAlign w:val="center"/>
           </w:tcPr>
@@ -1262,10 +1000,10 @@
             <w:r/>
             <w:r>
               <w:rPr>
-                <w:rFonts w:ascii="Calibri" w:hAnsi="Calibri" w:eastAsia="ＭＳ 明朝" w:cs="Calibri" w:eastAsiaTheme="minorEastAsia" w:csTheme="minorBidi"/>
+                <w:rFonts w:ascii="Calibri" w:hAnsi="Calibri"/>
+                <w:b w:val="0"/>
                 <w:color w:val="182535"/>
                 <w:sz w:val="15"/>
-                <w:szCs w:val="22"/>
               </w:rPr>
               <w:t>5</w:t>
             </w:r>
@@ -1273,18 +1011,12 @@
         </w:tc>
         <w:tc>
           <w:tcPr>
-            <w:tcW w:w="850" w:type="dxa"/>
-            <w:tcBorders>
-              <w:top w:val="single" w:sz="4" w:space="0" w:color="auto"/>
-              <w:left w:val="single" w:sz="4" w:space="0" w:color="auto"/>
-              <w:bottom w:val="single" w:sz="4" w:space="0" w:color="auto"/>
-              <w:right w:val="single" w:sz="4" w:space="0" w:color="auto"/>
-            </w:tcBorders>
+            <w:tcW w:type="dxa" w:w="850"/>
             <w:tcMar>
               <w:top w:w="70" w:type="dxa"/>
-              <w:left w:w="120" w:type="dxa"/>
+              <w:start w:w="120" w:type="dxa"/>
               <w:bottom w:w="70" w:type="dxa"/>
-              <w:right w:w="120" w:type="dxa"/>
+              <w:end w:w="120" w:type="dxa"/>
             </w:tcMar>
             <w:vAlign w:val="center"/>
           </w:tcPr>
@@ -1296,10 +1028,10 @@
             <w:r/>
             <w:r>
               <w:rPr>
-                <w:rFonts w:ascii="Calibri" w:hAnsi="Calibri" w:eastAsia="ＭＳ 明朝" w:cs="Calibri" w:eastAsiaTheme="minorEastAsia" w:csTheme="minorBidi"/>
+                <w:rFonts w:ascii="Calibri" w:hAnsi="Calibri"/>
+                <w:b w:val="0"/>
                 <w:color w:val="182535"/>
                 <w:sz w:val="15"/>
-                <w:szCs w:val="22"/>
               </w:rPr>
               <w:t>4</w:t>
             </w:r>
@@ -1307,18 +1039,12 @@
         </w:tc>
         <w:tc>
           <w:tcPr>
-            <w:tcW w:w="1450" w:type="dxa"/>
-            <w:tcBorders>
-              <w:top w:val="single" w:sz="4" w:space="0" w:color="auto"/>
-              <w:left w:val="single" w:sz="4" w:space="0" w:color="auto"/>
-              <w:bottom w:val="single" w:sz="4" w:space="0" w:color="auto"/>
-              <w:right w:val="single" w:sz="4" w:space="0" w:color="auto"/>
-            </w:tcBorders>
+            <w:tcW w:type="dxa" w:w="1450"/>
             <w:tcMar>
               <w:top w:w="70" w:type="dxa"/>
-              <w:left w:w="120" w:type="dxa"/>
+              <w:start w:w="120" w:type="dxa"/>
               <w:bottom w:w="70" w:type="dxa"/>
-              <w:right w:w="120" w:type="dxa"/>
+              <w:end w:w="120" w:type="dxa"/>
             </w:tcMar>
             <w:vAlign w:val="center"/>
           </w:tcPr>
@@ -1330,10 +1056,10 @@
             <w:r/>
             <w:r>
               <w:rPr>
-                <w:rFonts w:ascii="Calibri" w:hAnsi="Calibri" w:eastAsia="ＭＳ 明朝" w:cs="Calibri" w:eastAsiaTheme="minorEastAsia" w:csTheme="minorBidi"/>
+                <w:rFonts w:ascii="Calibri" w:hAnsi="Calibri"/>
+                <w:b w:val="0"/>
                 <w:color w:val="182535"/>
                 <w:sz w:val="15"/>
-                <w:szCs w:val="22"/>
               </w:rPr>
               <w:t>0</w:t>
             </w:r>
@@ -1341,18 +1067,12 @@
         </w:tc>
         <w:tc>
           <w:tcPr>
-            <w:tcW w:w="4980" w:type="dxa"/>
-            <w:tcBorders>
-              <w:top w:val="single" w:sz="4" w:space="0" w:color="auto"/>
-              <w:left w:val="single" w:sz="4" w:space="0" w:color="auto"/>
-              <w:bottom w:val="single" w:sz="4" w:space="0" w:color="auto"/>
-              <w:right w:val="single" w:sz="4" w:space="0" w:color="auto"/>
-            </w:tcBorders>
+            <w:tcW w:type="dxa" w:w="4980"/>
             <w:tcMar>
               <w:top w:w="70" w:type="dxa"/>
-              <w:left w:w="120" w:type="dxa"/>
+              <w:start w:w="120" w:type="dxa"/>
               <w:bottom w:w="70" w:type="dxa"/>
-              <w:right w:w="120" w:type="dxa"/>
+              <w:end w:w="120" w:type="dxa"/>
             </w:tcMar>
             <w:vAlign w:val="center"/>
           </w:tcPr>
@@ -1364,10 +1084,10 @@
             <w:r/>
             <w:r>
               <w:rPr>
-                <w:rFonts w:ascii="Calibri" w:hAnsi="Calibri" w:eastAsia="ＭＳ 明朝" w:cs="Calibri" w:eastAsiaTheme="minorEastAsia" w:csTheme="minorBidi"/>
+                <w:rFonts w:ascii="Calibri" w:hAnsi="Calibri"/>
+                <w:b w:val="0"/>
                 <w:color w:val="182535"/>
                 <w:sz w:val="15"/>
-                <w:szCs w:val="22"/>
               </w:rPr>
               <w:t>Longer hidden dependency chain</w:t>
             </w:r>
@@ -1380,18 +1100,12 @@
         </w:trPr>
         <w:tc>
           <w:tcPr>
-            <w:tcW w:w="2050" w:type="dxa"/>
-            <w:tcBorders>
-              <w:top w:val="single" w:sz="4" w:space="0" w:color="auto"/>
-              <w:left w:val="single" w:sz="4" w:space="0" w:color="auto"/>
-              <w:bottom w:val="single" w:sz="4" w:space="0" w:color="auto"/>
-              <w:right w:val="single" w:sz="4" w:space="0" w:color="auto"/>
-            </w:tcBorders>
+            <w:tcW w:type="dxa" w:w="2050"/>
             <w:tcMar>
               <w:top w:w="70" w:type="dxa"/>
-              <w:left w:w="120" w:type="dxa"/>
+              <w:start w:w="120" w:type="dxa"/>
               <w:bottom w:w="70" w:type="dxa"/>
-              <w:right w:w="120" w:type="dxa"/>
+              <w:end w:w="120" w:type="dxa"/>
             </w:tcMar>
             <w:vAlign w:val="center"/>
           </w:tcPr>
@@ -1403,10 +1117,10 @@
             <w:r/>
             <w:r>
               <w:rPr>
-                <w:rFonts w:ascii="Calibri" w:hAnsi="Calibri" w:eastAsia="ＭＳ 明朝" w:cs="Calibri" w:eastAsiaTheme="minorEastAsia" w:csTheme="minorBidi"/>
+                <w:rFonts w:ascii="Calibri" w:hAnsi="Calibri"/>
+                <w:b w:val="0"/>
                 <w:color w:val="182535"/>
                 <w:sz w:val="15"/>
-                <w:szCs w:val="22"/>
               </w:rPr>
               <w:t>Connected distractors</w:t>
             </w:r>
@@ -1414,18 +1128,12 @@
         </w:tc>
         <w:tc>
           <w:tcPr>
-            <w:tcW w:w="750" w:type="dxa"/>
-            <w:tcBorders>
-              <w:top w:val="single" w:sz="4" w:space="0" w:color="auto"/>
-              <w:left w:val="single" w:sz="4" w:space="0" w:color="auto"/>
-              <w:bottom w:val="single" w:sz="4" w:space="0" w:color="auto"/>
-              <w:right w:val="single" w:sz="4" w:space="0" w:color="auto"/>
-            </w:tcBorders>
+            <w:tcW w:type="dxa" w:w="750"/>
             <w:tcMar>
               <w:top w:w="70" w:type="dxa"/>
-              <w:left w:w="120" w:type="dxa"/>
+              <w:start w:w="120" w:type="dxa"/>
               <w:bottom w:w="70" w:type="dxa"/>
-              <w:right w:w="120" w:type="dxa"/>
+              <w:end w:w="120" w:type="dxa"/>
             </w:tcMar>
             <w:vAlign w:val="center"/>
           </w:tcPr>
@@ -1437,10 +1145,10 @@
             <w:r/>
             <w:r>
               <w:rPr>
-                <w:rFonts w:ascii="Calibri" w:hAnsi="Calibri" w:eastAsia="ＭＳ 明朝" w:cs="Calibri" w:eastAsiaTheme="minorEastAsia" w:csTheme="minorBidi"/>
+                <w:rFonts w:ascii="Calibri" w:hAnsi="Calibri"/>
+                <w:b w:val="0"/>
                 <w:color w:val="182535"/>
                 <w:sz w:val="15"/>
-                <w:szCs w:val="22"/>
               </w:rPr>
               <w:t>5</w:t>
             </w:r>
@@ -1448,18 +1156,12 @@
         </w:tc>
         <w:tc>
           <w:tcPr>
-            <w:tcW w:w="850" w:type="dxa"/>
-            <w:tcBorders>
-              <w:top w:val="single" w:sz="4" w:space="0" w:color="auto"/>
-              <w:left w:val="single" w:sz="4" w:space="0" w:color="auto"/>
-              <w:bottom w:val="single" w:sz="4" w:space="0" w:color="auto"/>
-              <w:right w:val="single" w:sz="4" w:space="0" w:color="auto"/>
-            </w:tcBorders>
+            <w:tcW w:type="dxa" w:w="850"/>
             <w:tcMar>
               <w:top w:w="70" w:type="dxa"/>
-              <w:left w:w="120" w:type="dxa"/>
+              <w:start w:w="120" w:type="dxa"/>
               <w:bottom w:w="70" w:type="dxa"/>
-              <w:right w:w="120" w:type="dxa"/>
+              <w:end w:w="120" w:type="dxa"/>
             </w:tcMar>
             <w:vAlign w:val="center"/>
           </w:tcPr>
@@ -1471,10 +1173,10 @@
             <w:r/>
             <w:r>
               <w:rPr>
-                <w:rFonts w:ascii="Calibri" w:hAnsi="Calibri" w:eastAsia="ＭＳ 明朝" w:cs="Calibri" w:eastAsiaTheme="minorEastAsia" w:csTheme="minorBidi"/>
+                <w:rFonts w:ascii="Calibri" w:hAnsi="Calibri"/>
+                <w:b w:val="0"/>
                 <w:color w:val="182535"/>
                 <w:sz w:val="15"/>
-                <w:szCs w:val="22"/>
               </w:rPr>
               <w:t>4</w:t>
             </w:r>
@@ -1482,18 +1184,12 @@
         </w:tc>
         <w:tc>
           <w:tcPr>
-            <w:tcW w:w="1450" w:type="dxa"/>
-            <w:tcBorders>
-              <w:top w:val="single" w:sz="4" w:space="0" w:color="auto"/>
-              <w:left w:val="single" w:sz="4" w:space="0" w:color="auto"/>
-              <w:bottom w:val="single" w:sz="4" w:space="0" w:color="auto"/>
-              <w:right w:val="single" w:sz="4" w:space="0" w:color="auto"/>
-            </w:tcBorders>
+            <w:tcW w:type="dxa" w:w="1450"/>
             <w:tcMar>
               <w:top w:w="70" w:type="dxa"/>
-              <w:left w:w="120" w:type="dxa"/>
+              <w:start w:w="120" w:type="dxa"/>
               <w:bottom w:w="70" w:type="dxa"/>
-              <w:right w:w="120" w:type="dxa"/>
+              <w:end w:w="120" w:type="dxa"/>
             </w:tcMar>
             <w:vAlign w:val="center"/>
           </w:tcPr>
@@ -1505,10 +1201,10 @@
             <w:r/>
             <w:r>
               <w:rPr>
-                <w:rFonts w:ascii="Calibri" w:hAnsi="Calibri" w:eastAsia="ＭＳ 明朝" w:cs="Calibri" w:eastAsiaTheme="minorEastAsia" w:csTheme="minorBidi"/>
+                <w:rFonts w:ascii="Calibri" w:hAnsi="Calibri"/>
+                <w:b w:val="0"/>
                 <w:color w:val="182535"/>
                 <w:sz w:val="15"/>
-                <w:szCs w:val="22"/>
               </w:rPr>
               <w:t>10 CINs</w:t>
             </w:r>
@@ -1516,18 +1212,12 @@
         </w:tc>
         <w:tc>
           <w:tcPr>
-            <w:tcW w:w="4980" w:type="dxa"/>
-            <w:tcBorders>
-              <w:top w:val="single" w:sz="4" w:space="0" w:color="auto"/>
-              <w:left w:val="single" w:sz="4" w:space="0" w:color="auto"/>
-              <w:bottom w:val="single" w:sz="4" w:space="0" w:color="auto"/>
-              <w:right w:val="single" w:sz="4" w:space="0" w:color="auto"/>
-            </w:tcBorders>
+            <w:tcW w:type="dxa" w:w="4980"/>
             <w:tcMar>
               <w:top w:w="70" w:type="dxa"/>
-              <w:left w:w="120" w:type="dxa"/>
+              <w:start w:w="120" w:type="dxa"/>
               <w:bottom w:w="70" w:type="dxa"/>
-              <w:right w:w="120" w:type="dxa"/>
+              <w:end w:w="120" w:type="dxa"/>
             </w:tcMar>
             <w:vAlign w:val="center"/>
           </w:tcPr>
@@ -1539,10 +1229,10 @@
             <w:r/>
             <w:r>
               <w:rPr>
-                <w:rFonts w:ascii="Calibri" w:hAnsi="Calibri" w:eastAsia="ＭＳ 明朝" w:cs="Calibri" w:eastAsiaTheme="minorEastAsia" w:csTheme="minorBidi"/>
+                <w:rFonts w:ascii="Calibri" w:hAnsi="Calibri"/>
+                <w:b w:val="0"/>
                 <w:color w:val="182535"/>
                 <w:sz w:val="15"/>
-                <w:szCs w:val="22"/>
               </w:rPr>
               <w:t>Type-compatible irrelevant branches</w:t>
             </w:r>
@@ -1556,16 +1246,6 @@
         <w:jc w:val="center"/>
       </w:pPr>
       <w:r>
-        <w:rPr>
-          <w:rFonts w:ascii="Calibri" w:hAnsi="Calibri" w:eastAsia="ＭＳ 明朝" w:cs="Calibri" w:eastAsiaTheme="minorEastAsia" w:csTheme="minorBidi"/>
-          <w:b/>
-          <w:bCs/>
-          <w:i/>
-          <w:iCs/>
-          <w:color w:val="56606C"/>
-          <w:sz w:val="15"/>
-          <w:szCs w:val="18"/>
-        </w:rPr>
         <w:t>Table 2. Final paired extension: five frozen graph seeds per condition.</w:t>
       </w:r>
     </w:p>
@@ -1576,21 +1256,19 @@
       </w:pPr>
       <w:r>
         <w:rPr>
-          <w:rFonts w:ascii="Calibri" w:hAnsi="Calibri" w:eastAsia="ＭＳ 明朝" w:cs="Calibri" w:eastAsiaTheme="minorEastAsia" w:csTheme="minorBidi"/>
+          <w:rFonts w:ascii="Calibri" w:hAnsi="Calibri"/>
           <w:b/>
-          <w:bCs/>
           <w:color w:val="1F4D78"/>
           <w:sz w:val="20"/>
-          <w:szCs w:val="22"/>
         </w:rPr>
         <w:t xml:space="preserve">State strategies. </w:t>
       </w:r>
       <w:r>
         <w:rPr>
-          <w:rFonts w:ascii="Calibri" w:hAnsi="Calibri" w:eastAsia="ＭＳ 明朝" w:cs="Calibri" w:eastAsiaTheme="minorEastAsia" w:csTheme="minorBidi"/>
+          <w:rFonts w:ascii="Calibri" w:hAnsi="Calibri"/>
+          <w:b w:val="0"/>
           <w:color w:val="182535"/>
           <w:sz w:val="20"/>
-          <w:szCs w:val="22"/>
         </w:rPr>
         <w:t>Full history adds no state suffix. Paper restatement appends every known value, and JSON serializes the same values as a compact object. Legacy dependency pruning retains values whose types are consumed anywhere in the visible schema set; every observed type remained globally consumable, producing the 404.7-byte null result. Live dependency pruning instead computes a conservative backward frontier from the public target and type signatures, retains one non-conflicting value per still-needed exact type, does not retire failed calls, and emits no suffix after target completion. Neither pruning strategy consults hidden edges, node labels, ground-truth values, or the hidden target path.</w:t>
       </w:r>
@@ -1602,32 +1280,29 @@
       </w:pPr>
       <w:r>
         <w:rPr>
-          <w:rFonts w:ascii="Calibri" w:hAnsi="Calibri" w:eastAsia="ＭＳ 明朝" w:cs="Calibri" w:eastAsiaTheme="minorEastAsia" w:csTheme="minorBidi"/>
+          <w:rFonts w:ascii="Calibri" w:hAnsi="Calibri"/>
           <w:b/>
-          <w:bCs/>
           <w:color w:val="1F4D78"/>
           <w:sz w:val="20"/>
-          <w:szCs w:val="22"/>
         </w:rPr>
         <w:t xml:space="preserve">Measures. </w:t>
       </w:r>
       <w:r>
         <w:rPr>
-          <w:rFonts w:ascii="Calibri" w:hAnsi="Calibri" w:eastAsia="ＭＳ 明朝" w:cs="Calibri" w:eastAsiaTheme="minorEastAsia" w:csTheme="minorBidi"/>
+          <w:rFonts w:ascii="Calibri" w:hAnsi="Calibri"/>
+          <w:b w:val="0"/>
           <w:color w:val="182535"/>
           <w:sz w:val="20"/>
-          <w:szCs w:val="22"/>
         </w:rPr>
         <w:t>Primary outcomes are exact target success and total request-level prompt tokens. Secondary measures are completion tokens, tool calls, prompt tokens per success, success per 1,000 prompt tokens, cumulative bytes added by state suffixes, and trace-level failure codes. A trial may contain a recoverable intermediate error and still succeed, so error occurrences are not mutually exclusive final outcomes.</w:t>
       </w:r>
     </w:p>
     <w:p>
       <w:pPr>
-        <w:pageBreakBefore/>
         <w:spacing w:after="0"/>
       </w:pPr>
       <w:r>
-        <w:lastRenderedPageBreak/>
+        <w:br w:type="page"/>
       </w:r>
     </w:p>
     <w:p>
@@ -1635,14 +1310,6 @@
         <w:pStyle w:val="Heading1"/>
       </w:pPr>
       <w:r>
-        <w:rPr>
-          <w:rFonts w:ascii="Calibri" w:hAnsi="Calibri" w:eastAsia="ＭＳ ゴシック" w:cs="Calibri" w:asciiTheme="majorHAnsi" w:hAnsiTheme="majorHAnsi" w:eastAsiaTheme="majorEastAsia" w:csTheme="majorBidi"/>
-          <w:b/>
-          <w:bCs/>
-          <w:color w:val="2E74B5"/>
-          <w:sz w:val="24"/>
-          <w:szCs w:val="28"/>
-        </w:rPr>
         <w:t>4. Implementation Details &amp; Results</w:t>
       </w:r>
     </w:p>
@@ -1653,10 +1320,11 @@
       </w:pPr>
       <w:r>
         <w:rPr>
-          <w:rFonts w:ascii="Calibri" w:hAnsi="Calibri" w:eastAsia="ＭＳ 明朝" w:cs="Calibri" w:eastAsiaTheme="minorEastAsia" w:csTheme="minorBidi"/>
+          <w:rFonts w:ascii="Calibri" w:hAnsi="Calibri"/>
+          <w:b w:val="0"/>
+          <w:i w:val="0"/>
           <w:color w:val="182535"/>
           <w:sz w:val="20"/>
-          <w:szCs w:val="22"/>
         </w:rPr>
         <w:t>StateBench is implemented in Python 3.11 around the pinned generator/evaluator, with NetworkX for graph reconstruction, an OpenAI-compatible Groq provider, pandas for aggregation, and Matplotlib for figures. Each raw trial is written atomically as JSON. Resume logic skips completed pairs, short-window rate limits are retried without discarding the active conversation, and daily quota exhaustion stops safely for a later run. Stored traces include requests, tool calls, arguments, results, token counts, state suffix size, and canonical failure codes.</w:t>
       </w:r>
@@ -1664,25 +1332,11 @@
     <w:tbl>
       <w:tblPr>
         <w:tblStyle w:val="TableGrid"/>
-        <w:tblW w:w="10080" w:type="dxa"/>
+        <w:tblW w:type="dxa" w:w="10080"/>
         <w:jc w:val="left"/>
+        <w:tblLook w:firstColumn="1" w:firstRow="1" w:lastColumn="0" w:lastRow="0" w:noHBand="0" w:noVBand="1" w:val="04A0"/>
         <w:tblInd w:w="120" w:type="dxa"/>
-        <w:tblBorders>
-          <w:top w:val="single" w:sz="4" w:space="0" w:color="auto"/>
-          <w:left w:val="single" w:sz="4" w:space="0" w:color="auto"/>
-          <w:bottom w:val="single" w:sz="4" w:space="0" w:color="auto"/>
-          <w:right w:val="single" w:sz="4" w:space="0" w:color="auto"/>
-          <w:insideH w:val="single" w:sz="4" w:space="0" w:color="auto"/>
-          <w:insideV w:val="single" w:sz="4" w:space="0" w:color="auto"/>
-        </w:tblBorders>
         <w:tblLayout w:type="fixed"/>
-        <w:tblCellMar>
-          <w:top w:w="0" w:type="dxa"/>
-          <w:left w:w="108" w:type="dxa"/>
-          <w:bottom w:w="0" w:type="dxa"/>
-          <w:right w:w="108" w:type="dxa"/>
-        </w:tblCellMar>
-        <w:tblLook w:firstRow="1" w:firstColumn="1" w:noVBand="1"/>
       </w:tblPr>
       <w:tblGrid>
         <w:gridCol w:w="2200"/>
@@ -1695,24 +1349,18 @@
       </w:tblGrid>
       <w:tr>
         <w:trPr>
+          <w:tblHeader w:val="true"/>
           <w:cantSplit/>
-          <w:tblHeader/>
         </w:trPr>
         <w:tc>
           <w:tcPr>
-            <w:tcW w:w="2200" w:type="dxa"/>
-            <w:tcBorders>
-              <w:top w:val="single" w:sz="4" w:space="0" w:color="auto"/>
-              <w:left w:val="single" w:sz="4" w:space="0" w:color="auto"/>
-              <w:bottom w:val="single" w:sz="4" w:space="0" w:color="auto"/>
-              <w:right w:val="single" w:sz="4" w:space="0" w:color="auto"/>
-            </w:tcBorders>
-            <w:shd w:val="clear" w:fill="F2F4F7"/>
+            <w:tcW w:type="dxa" w:w="2200"/>
+            <w:shd w:fill="F2F4F7"/>
             <w:tcMar>
               <w:top w:w="70" w:type="dxa"/>
-              <w:left w:w="120" w:type="dxa"/>
+              <w:start w:w="120" w:type="dxa"/>
               <w:bottom w:w="70" w:type="dxa"/>
-              <w:right w:w="120" w:type="dxa"/>
+              <w:end w:w="120" w:type="dxa"/>
             </w:tcMar>
             <w:vAlign w:val="center"/>
           </w:tcPr>
@@ -1724,12 +1372,10 @@
             <w:r/>
             <w:r>
               <w:rPr>
-                <w:rFonts w:ascii="Calibri" w:hAnsi="Calibri" w:eastAsia="ＭＳ 明朝" w:cs="Calibri" w:eastAsiaTheme="minorEastAsia" w:csTheme="minorBidi"/>
+                <w:rFonts w:ascii="Calibri" w:hAnsi="Calibri"/>
                 <w:b/>
-                <w:bCs/>
                 <w:color w:val="1F4D78"/>
                 <w:sz w:val="14"/>
-                <w:szCs w:val="22"/>
               </w:rPr>
               <w:t>Strategy</w:t>
             </w:r>
@@ -1737,19 +1383,13 @@
         </w:tc>
         <w:tc>
           <w:tcPr>
-            <w:tcW w:w="850" w:type="dxa"/>
-            <w:tcBorders>
-              <w:top w:val="single" w:sz="4" w:space="0" w:color="auto"/>
-              <w:left w:val="single" w:sz="4" w:space="0" w:color="auto"/>
-              <w:bottom w:val="single" w:sz="4" w:space="0" w:color="auto"/>
-              <w:right w:val="single" w:sz="4" w:space="0" w:color="auto"/>
-            </w:tcBorders>
-            <w:shd w:val="clear" w:fill="F2F4F7"/>
+            <w:tcW w:type="dxa" w:w="850"/>
+            <w:shd w:fill="F2F4F7"/>
             <w:tcMar>
               <w:top w:w="70" w:type="dxa"/>
-              <w:left w:w="120" w:type="dxa"/>
+              <w:start w:w="120" w:type="dxa"/>
               <w:bottom w:w="70" w:type="dxa"/>
-              <w:right w:w="120" w:type="dxa"/>
+              <w:end w:w="120" w:type="dxa"/>
             </w:tcMar>
             <w:vAlign w:val="center"/>
           </w:tcPr>
@@ -1761,12 +1401,10 @@
             <w:r/>
             <w:r>
               <w:rPr>
-                <w:rFonts w:ascii="Calibri" w:hAnsi="Calibri" w:eastAsia="ＭＳ 明朝" w:cs="Calibri" w:eastAsiaTheme="minorEastAsia" w:csTheme="minorBidi"/>
+                <w:rFonts w:ascii="Calibri" w:hAnsi="Calibri"/>
                 <w:b/>
-                <w:bCs/>
                 <w:color w:val="1F4D78"/>
                 <w:sz w:val="14"/>
-                <w:szCs w:val="22"/>
               </w:rPr>
               <w:t>Success</w:t>
             </w:r>
@@ -1774,119 +1412,13 @@
         </w:tc>
         <w:tc>
           <w:tcPr>
-            <w:tcW w:w="1350" w:type="dxa"/>
-            <w:tcBorders>
-              <w:top w:val="single" w:sz="4" w:space="0" w:color="auto"/>
-              <w:left w:val="single" w:sz="4" w:space="0" w:color="auto"/>
-              <w:bottom w:val="single" w:sz="4" w:space="0" w:color="auto"/>
-              <w:right w:val="single" w:sz="4" w:space="0" w:color="auto"/>
-            </w:tcBorders>
-            <w:shd w:val="clear" w:fill="F2F4F7"/>
+            <w:tcW w:type="dxa" w:w="1350"/>
+            <w:shd w:fill="F2F4F7"/>
             <w:tcMar>
               <w:top w:w="70" w:type="dxa"/>
-              <w:left w:w="120" w:type="dxa"/>
+              <w:start w:w="120" w:type="dxa"/>
               <w:bottom w:w="70" w:type="dxa"/>
-              <w:right w:w="120" w:type="dxa"/>
-            </w:tcMar>
-            <w:vAlign w:val="center"/>
-          </w:tcPr>
-          <w:p>
-            <w:pPr>
-              <w:spacing w:before="0" w:after="0" w:line="240" w:lineRule="auto"/>
-              <w:jc w:val="center"/>
-            </w:pPr>
-            <w:r>
-              <w:rPr>
-                <w:rFonts w:ascii="Calibri" w:hAnsi="Calibri" w:eastAsia="ＭＳ 明朝" w:cs="Calibri" w:eastAsiaTheme="minorEastAsia" w:csTheme="minorBidi"/>
-                <w:b/>
-                <w:bCs/>
-                <w:color w:val="1F4D78"/>
-                <w:sz w:val="14"/>
-                <w:szCs w:val="22"/>
-              </w:rPr>
-              <w:t>Prompt</w:t>
-            </w:r>
-            <w:r>
-              <w:br w:type="textWrapping"/>
-            </w:r>
-            <w:r>
-              <w:rPr>
-                <w:rFonts w:ascii="Calibri" w:hAnsi="Calibri" w:eastAsia="ＭＳ 明朝" w:cs="Calibri" w:eastAsiaTheme="minorEastAsia" w:csTheme="minorBidi"/>
-                <w:b/>
-                <w:bCs/>
-                <w:color w:val="1F4D78"/>
-                <w:sz w:val="14"/>
-                <w:szCs w:val="22"/>
-              </w:rPr>
-              <w:t>tokens</w:t>
-            </w:r>
-          </w:p>
-        </w:tc>
-        <w:tc>
-          <w:tcPr>
-            <w:tcW w:w="1400" w:type="dxa"/>
-            <w:tcBorders>
-              <w:top w:val="single" w:sz="4" w:space="0" w:color="auto"/>
-              <w:left w:val="single" w:sz="4" w:space="0" w:color="auto"/>
-              <w:bottom w:val="single" w:sz="4" w:space="0" w:color="auto"/>
-              <w:right w:val="single" w:sz="4" w:space="0" w:color="auto"/>
-            </w:tcBorders>
-            <w:shd w:val="clear" w:fill="F2F4F7"/>
-            <w:tcMar>
-              <w:top w:w="70" w:type="dxa"/>
-              <w:left w:w="120" w:type="dxa"/>
-              <w:bottom w:w="70" w:type="dxa"/>
-              <w:right w:w="120" w:type="dxa"/>
-            </w:tcMar>
-            <w:vAlign w:val="center"/>
-          </w:tcPr>
-          <w:p>
-            <w:pPr>
-              <w:spacing w:before="0" w:after="0" w:line="240" w:lineRule="auto"/>
-              <w:jc w:val="center"/>
-            </w:pPr>
-            <w:r>
-              <w:rPr>
-                <w:rFonts w:ascii="Calibri" w:hAnsi="Calibri" w:eastAsia="ＭＳ 明朝" w:cs="Calibri" w:eastAsiaTheme="minorEastAsia" w:csTheme="minorBidi"/>
-                <w:b/>
-                <w:bCs/>
-                <w:color w:val="1F4D78"/>
-                <w:sz w:val="14"/>
-                <w:szCs w:val="22"/>
-              </w:rPr>
-              <w:t>Completion</w:t>
-            </w:r>
-            <w:r>
-              <w:br w:type="textWrapping"/>
-            </w:r>
-            <w:r>
-              <w:rPr>
-                <w:rFonts w:ascii="Calibri" w:hAnsi="Calibri" w:eastAsia="ＭＳ 明朝" w:cs="Calibri" w:eastAsiaTheme="minorEastAsia" w:csTheme="minorBidi"/>
-                <w:b/>
-                <w:bCs/>
-                <w:color w:val="1F4D78"/>
-                <w:sz w:val="14"/>
-                <w:szCs w:val="22"/>
-              </w:rPr>
-              <w:t>tokens</w:t>
-            </w:r>
-          </w:p>
-        </w:tc>
-        <w:tc>
-          <w:tcPr>
-            <w:tcW w:w="850" w:type="dxa"/>
-            <w:tcBorders>
-              <w:top w:val="single" w:sz="4" w:space="0" w:color="auto"/>
-              <w:left w:val="single" w:sz="4" w:space="0" w:color="auto"/>
-              <w:bottom w:val="single" w:sz="4" w:space="0" w:color="auto"/>
-              <w:right w:val="single" w:sz="4" w:space="0" w:color="auto"/>
-            </w:tcBorders>
-            <w:shd w:val="clear" w:fill="F2F4F7"/>
-            <w:tcMar>
-              <w:top w:w="70" w:type="dxa"/>
-              <w:left w:w="120" w:type="dxa"/>
-              <w:bottom w:w="70" w:type="dxa"/>
-              <w:right w:w="120" w:type="dxa"/>
+              <w:end w:w="120" w:type="dxa"/>
             </w:tcMar>
             <w:vAlign w:val="center"/>
           </w:tcPr>
@@ -1898,32 +1430,26 @@
             <w:r/>
             <w:r>
               <w:rPr>
-                <w:rFonts w:ascii="Calibri" w:hAnsi="Calibri" w:eastAsia="ＭＳ 明朝" w:cs="Calibri" w:eastAsiaTheme="minorEastAsia" w:csTheme="minorBidi"/>
+                <w:rFonts w:ascii="Calibri" w:hAnsi="Calibri"/>
                 <w:b/>
-                <w:bCs/>
                 <w:color w:val="1F4D78"/>
                 <w:sz w:val="14"/>
-                <w:szCs w:val="22"/>
               </w:rPr>
-              <w:t>Calls</w:t>
+              <w:t>Prompt</w:t>
+              <w:br/>
+              <w:t>tokens</w:t>
             </w:r>
           </w:p>
         </w:tc>
         <w:tc>
           <w:tcPr>
-            <w:tcW w:w="1250" w:type="dxa"/>
-            <w:tcBorders>
-              <w:top w:val="single" w:sz="4" w:space="0" w:color="auto"/>
-              <w:left w:val="single" w:sz="4" w:space="0" w:color="auto"/>
-              <w:bottom w:val="single" w:sz="4" w:space="0" w:color="auto"/>
-              <w:right w:val="single" w:sz="4" w:space="0" w:color="auto"/>
-            </w:tcBorders>
-            <w:shd w:val="clear" w:fill="F2F4F7"/>
+            <w:tcW w:type="dxa" w:w="1400"/>
+            <w:shd w:fill="F2F4F7"/>
             <w:tcMar>
               <w:top w:w="70" w:type="dxa"/>
-              <w:left w:w="120" w:type="dxa"/>
+              <w:start w:w="120" w:type="dxa"/>
               <w:bottom w:w="70" w:type="dxa"/>
-              <w:right w:w="120" w:type="dxa"/>
+              <w:end w:w="120" w:type="dxa"/>
             </w:tcMar>
             <w:vAlign w:val="center"/>
           </w:tcPr>
@@ -1932,48 +1458,29 @@
               <w:spacing w:before="0" w:after="0" w:line="240" w:lineRule="auto"/>
               <w:jc w:val="center"/>
             </w:pPr>
+            <w:r/>
             <w:r>
               <w:rPr>
-                <w:rFonts w:ascii="Calibri" w:hAnsi="Calibri" w:eastAsia="ＭＳ 明朝" w:cs="Calibri" w:eastAsiaTheme="minorEastAsia" w:csTheme="minorBidi"/>
+                <w:rFonts w:ascii="Calibri" w:hAnsi="Calibri"/>
                 <w:b/>
-                <w:bCs/>
                 <w:color w:val="1F4D78"/>
                 <w:sz w:val="14"/>
-                <w:szCs w:val="22"/>
               </w:rPr>
-              <w:t>State</w:t>
-            </w:r>
-            <w:r>
-              <w:br w:type="textWrapping"/>
-            </w:r>
-            <w:r>
-              <w:rPr>
-                <w:rFonts w:ascii="Calibri" w:hAnsi="Calibri" w:eastAsia="ＭＳ 明朝" w:cs="Calibri" w:eastAsiaTheme="minorEastAsia" w:csTheme="minorBidi"/>
-                <w:b/>
-                <w:bCs/>
-                <w:color w:val="1F4D78"/>
-                <w:sz w:val="14"/>
-                <w:szCs w:val="22"/>
-              </w:rPr>
-              <w:t>bytes</w:t>
+              <w:t>Completion</w:t>
+              <w:br/>
+              <w:t>tokens</w:t>
             </w:r>
           </w:p>
         </w:tc>
         <w:tc>
           <w:tcPr>
-            <w:tcW w:w="2180" w:type="dxa"/>
-            <w:tcBorders>
-              <w:top w:val="single" w:sz="4" w:space="0" w:color="auto"/>
-              <w:left w:val="single" w:sz="4" w:space="0" w:color="auto"/>
-              <w:bottom w:val="single" w:sz="4" w:space="0" w:color="auto"/>
-              <w:right w:val="single" w:sz="4" w:space="0" w:color="auto"/>
-            </w:tcBorders>
-            <w:shd w:val="clear" w:fill="F2F4F7"/>
+            <w:tcW w:type="dxa" w:w="850"/>
+            <w:shd w:fill="F2F4F7"/>
             <w:tcMar>
               <w:top w:w="70" w:type="dxa"/>
-              <w:left w:w="120" w:type="dxa"/>
+              <w:start w:w="120" w:type="dxa"/>
               <w:bottom w:w="70" w:type="dxa"/>
-              <w:right w:w="120" w:type="dxa"/>
+              <w:end w:w="120" w:type="dxa"/>
             </w:tcMar>
             <w:vAlign w:val="center"/>
           </w:tcPr>
@@ -1982,29 +1489,76 @@
               <w:spacing w:before="0" w:after="0" w:line="240" w:lineRule="auto"/>
               <w:jc w:val="center"/>
             </w:pPr>
+            <w:r/>
             <w:r>
               <w:rPr>
-                <w:rFonts w:ascii="Calibri" w:hAnsi="Calibri" w:eastAsia="ＭＳ 明朝" w:cs="Calibri" w:eastAsiaTheme="minorEastAsia" w:csTheme="minorBidi"/>
+                <w:rFonts w:ascii="Calibri" w:hAnsi="Calibri"/>
                 <w:b/>
-                <w:bCs/>
                 <w:color w:val="1F4D78"/>
                 <w:sz w:val="14"/>
-                <w:szCs w:val="22"/>
+              </w:rPr>
+              <w:t>Calls</w:t>
+            </w:r>
+          </w:p>
+        </w:tc>
+        <w:tc>
+          <w:tcPr>
+            <w:tcW w:type="dxa" w:w="1250"/>
+            <w:shd w:fill="F2F4F7"/>
+            <w:tcMar>
+              <w:top w:w="70" w:type="dxa"/>
+              <w:start w:w="120" w:type="dxa"/>
+              <w:bottom w:w="70" w:type="dxa"/>
+              <w:end w:w="120" w:type="dxa"/>
+            </w:tcMar>
+            <w:vAlign w:val="center"/>
+          </w:tcPr>
+          <w:p>
+            <w:pPr>
+              <w:spacing w:before="0" w:after="0" w:line="240" w:lineRule="auto"/>
+              <w:jc w:val="center"/>
+            </w:pPr>
+            <w:r/>
+            <w:r>
+              <w:rPr>
+                <w:rFonts w:ascii="Calibri" w:hAnsi="Calibri"/>
+                <w:b/>
+                <w:color w:val="1F4D78"/>
+                <w:sz w:val="14"/>
+              </w:rPr>
+              <w:t>State</w:t>
+              <w:br/>
+              <w:t>bytes</w:t>
+            </w:r>
+          </w:p>
+        </w:tc>
+        <w:tc>
+          <w:tcPr>
+            <w:tcW w:type="dxa" w:w="2180"/>
+            <w:shd w:fill="F2F4F7"/>
+            <w:tcMar>
+              <w:top w:w="70" w:type="dxa"/>
+              <w:start w:w="120" w:type="dxa"/>
+              <w:bottom w:w="70" w:type="dxa"/>
+              <w:end w:w="120" w:type="dxa"/>
+            </w:tcMar>
+            <w:vAlign w:val="center"/>
+          </w:tcPr>
+          <w:p>
+            <w:pPr>
+              <w:spacing w:before="0" w:after="0" w:line="240" w:lineRule="auto"/>
+              <w:jc w:val="center"/>
+            </w:pPr>
+            <w:r/>
+            <w:r>
+              <w:rPr>
+                <w:rFonts w:ascii="Calibri" w:hAnsi="Calibri"/>
+                <w:b/>
+                <w:color w:val="1F4D78"/>
+                <w:sz w:val="14"/>
               </w:rPr>
               <w:t>Success /</w:t>
-            </w:r>
-            <w:r>
-              <w:br w:type="textWrapping"/>
-            </w:r>
-            <w:r>
-              <w:rPr>
-                <w:rFonts w:ascii="Calibri" w:hAnsi="Calibri" w:eastAsia="ＭＳ 明朝" w:cs="Calibri" w:eastAsiaTheme="minorEastAsia" w:csTheme="minorBidi"/>
-                <w:b/>
-                <w:bCs/>
-                <w:color w:val="1F4D78"/>
-                <w:sz w:val="14"/>
-                <w:szCs w:val="22"/>
-              </w:rPr>
+              <w:br/>
               <w:t>1k prompt</w:t>
             </w:r>
           </w:p>
@@ -2016,18 +1570,12 @@
         </w:trPr>
         <w:tc>
           <w:tcPr>
-            <w:tcW w:w="2200" w:type="dxa"/>
-            <w:tcBorders>
-              <w:top w:val="single" w:sz="4" w:space="0" w:color="auto"/>
-              <w:left w:val="single" w:sz="4" w:space="0" w:color="auto"/>
-              <w:bottom w:val="single" w:sz="4" w:space="0" w:color="auto"/>
-              <w:right w:val="single" w:sz="4" w:space="0" w:color="auto"/>
-            </w:tcBorders>
+            <w:tcW w:type="dxa" w:w="2200"/>
             <w:tcMar>
               <w:top w:w="70" w:type="dxa"/>
-              <w:left w:w="120" w:type="dxa"/>
+              <w:start w:w="120" w:type="dxa"/>
               <w:bottom w:w="70" w:type="dxa"/>
-              <w:right w:w="120" w:type="dxa"/>
+              <w:end w:w="120" w:type="dxa"/>
             </w:tcMar>
             <w:vAlign w:val="center"/>
           </w:tcPr>
@@ -2039,10 +1587,10 @@
             <w:r/>
             <w:r>
               <w:rPr>
-                <w:rFonts w:ascii="Calibri" w:hAnsi="Calibri" w:eastAsia="ＭＳ 明朝" w:cs="Calibri" w:eastAsiaTheme="minorEastAsia" w:csTheme="minorBidi"/>
+                <w:rFonts w:ascii="Calibri" w:hAnsi="Calibri"/>
+                <w:b w:val="0"/>
                 <w:color w:val="182535"/>
                 <w:sz w:val="14"/>
-                <w:szCs w:val="22"/>
               </w:rPr>
               <w:t>Full history</w:t>
             </w:r>
@@ -2050,18 +1598,12 @@
         </w:tc>
         <w:tc>
           <w:tcPr>
-            <w:tcW w:w="850" w:type="dxa"/>
-            <w:tcBorders>
-              <w:top w:val="single" w:sz="4" w:space="0" w:color="auto"/>
-              <w:left w:val="single" w:sz="4" w:space="0" w:color="auto"/>
-              <w:bottom w:val="single" w:sz="4" w:space="0" w:color="auto"/>
-              <w:right w:val="single" w:sz="4" w:space="0" w:color="auto"/>
-            </w:tcBorders>
+            <w:tcW w:type="dxa" w:w="850"/>
             <w:tcMar>
               <w:top w:w="70" w:type="dxa"/>
-              <w:left w:w="120" w:type="dxa"/>
+              <w:start w:w="120" w:type="dxa"/>
               <w:bottom w:w="70" w:type="dxa"/>
-              <w:right w:w="120" w:type="dxa"/>
+              <w:end w:w="120" w:type="dxa"/>
             </w:tcMar>
             <w:vAlign w:val="center"/>
           </w:tcPr>
@@ -2073,10 +1615,10 @@
             <w:r/>
             <w:r>
               <w:rPr>
-                <w:rFonts w:ascii="Calibri" w:hAnsi="Calibri" w:eastAsia="ＭＳ 明朝" w:cs="Calibri" w:eastAsiaTheme="minorEastAsia" w:csTheme="minorBidi"/>
+                <w:rFonts w:ascii="Calibri" w:hAnsi="Calibri"/>
+                <w:b w:val="0"/>
                 <w:color w:val="182535"/>
                 <w:sz w:val="14"/>
-                <w:szCs w:val="22"/>
               </w:rPr>
               <w:t>12/15</w:t>
             </w:r>
@@ -2084,18 +1626,12 @@
         </w:tc>
         <w:tc>
           <w:tcPr>
-            <w:tcW w:w="1350" w:type="dxa"/>
-            <w:tcBorders>
-              <w:top w:val="single" w:sz="4" w:space="0" w:color="auto"/>
-              <w:left w:val="single" w:sz="4" w:space="0" w:color="auto"/>
-              <w:bottom w:val="single" w:sz="4" w:space="0" w:color="auto"/>
-              <w:right w:val="single" w:sz="4" w:space="0" w:color="auto"/>
-            </w:tcBorders>
+            <w:tcW w:type="dxa" w:w="1350"/>
             <w:tcMar>
               <w:top w:w="70" w:type="dxa"/>
-              <w:left w:w="120" w:type="dxa"/>
+              <w:start w:w="120" w:type="dxa"/>
               <w:bottom w:w="70" w:type="dxa"/>
-              <w:right w:w="120" w:type="dxa"/>
+              <w:end w:w="120" w:type="dxa"/>
             </w:tcMar>
             <w:vAlign w:val="center"/>
           </w:tcPr>
@@ -2107,10 +1643,10 @@
             <w:r/>
             <w:r>
               <w:rPr>
-                <w:rFonts w:ascii="Calibri" w:hAnsi="Calibri" w:eastAsia="ＭＳ 明朝" w:cs="Calibri" w:eastAsiaTheme="minorEastAsia" w:csTheme="minorBidi"/>
+                <w:rFonts w:ascii="Calibri" w:hAnsi="Calibri"/>
+                <w:b w:val="0"/>
                 <w:color w:val="182535"/>
                 <w:sz w:val="14"/>
-                <w:szCs w:val="22"/>
               </w:rPr>
               <w:t>7,515</w:t>
             </w:r>
@@ -2118,18 +1654,12 @@
         </w:tc>
         <w:tc>
           <w:tcPr>
-            <w:tcW w:w="1400" w:type="dxa"/>
-            <w:tcBorders>
-              <w:top w:val="single" w:sz="4" w:space="0" w:color="auto"/>
-              <w:left w:val="single" w:sz="4" w:space="0" w:color="auto"/>
-              <w:bottom w:val="single" w:sz="4" w:space="0" w:color="auto"/>
-              <w:right w:val="single" w:sz="4" w:space="0" w:color="auto"/>
-            </w:tcBorders>
+            <w:tcW w:type="dxa" w:w="1400"/>
             <w:tcMar>
               <w:top w:w="70" w:type="dxa"/>
-              <w:left w:w="120" w:type="dxa"/>
+              <w:start w:w="120" w:type="dxa"/>
               <w:bottom w:w="70" w:type="dxa"/>
-              <w:right w:w="120" w:type="dxa"/>
+              <w:end w:w="120" w:type="dxa"/>
             </w:tcMar>
             <w:vAlign w:val="center"/>
           </w:tcPr>
@@ -2141,10 +1671,10 @@
             <w:r/>
             <w:r>
               <w:rPr>
-                <w:rFonts w:ascii="Calibri" w:hAnsi="Calibri" w:eastAsia="ＭＳ 明朝" w:cs="Calibri" w:eastAsiaTheme="minorEastAsia" w:csTheme="minorBidi"/>
+                <w:rFonts w:ascii="Calibri" w:hAnsi="Calibri"/>
+                <w:b w:val="0"/>
                 <w:color w:val="182535"/>
                 <w:sz w:val="14"/>
-                <w:szCs w:val="22"/>
               </w:rPr>
               <w:t>6,357</w:t>
             </w:r>
@@ -2152,18 +1682,12 @@
         </w:tc>
         <w:tc>
           <w:tcPr>
-            <w:tcW w:w="850" w:type="dxa"/>
-            <w:tcBorders>
-              <w:top w:val="single" w:sz="4" w:space="0" w:color="auto"/>
-              <w:left w:val="single" w:sz="4" w:space="0" w:color="auto"/>
-              <w:bottom w:val="single" w:sz="4" w:space="0" w:color="auto"/>
-              <w:right w:val="single" w:sz="4" w:space="0" w:color="auto"/>
-            </w:tcBorders>
+            <w:tcW w:type="dxa" w:w="850"/>
             <w:tcMar>
               <w:top w:w="70" w:type="dxa"/>
-              <w:left w:w="120" w:type="dxa"/>
+              <w:start w:w="120" w:type="dxa"/>
               <w:bottom w:w="70" w:type="dxa"/>
-              <w:right w:w="120" w:type="dxa"/>
+              <w:end w:w="120" w:type="dxa"/>
             </w:tcMar>
             <w:vAlign w:val="center"/>
           </w:tcPr>
@@ -2175,10 +1699,10 @@
             <w:r/>
             <w:r>
               <w:rPr>
-                <w:rFonts w:ascii="Calibri" w:hAnsi="Calibri" w:eastAsia="ＭＳ 明朝" w:cs="Calibri" w:eastAsiaTheme="minorEastAsia" w:csTheme="minorBidi"/>
+                <w:rFonts w:ascii="Calibri" w:hAnsi="Calibri"/>
+                <w:b w:val="0"/>
                 <w:color w:val="182535"/>
                 <w:sz w:val="14"/>
-                <w:szCs w:val="22"/>
               </w:rPr>
               <w:t>4.67</w:t>
             </w:r>
@@ -2186,18 +1710,12 @@
         </w:tc>
         <w:tc>
           <w:tcPr>
-            <w:tcW w:w="1250" w:type="dxa"/>
-            <w:tcBorders>
-              <w:top w:val="single" w:sz="4" w:space="0" w:color="auto"/>
-              <w:left w:val="single" w:sz="4" w:space="0" w:color="auto"/>
-              <w:bottom w:val="single" w:sz="4" w:space="0" w:color="auto"/>
-              <w:right w:val="single" w:sz="4" w:space="0" w:color="auto"/>
-            </w:tcBorders>
+            <w:tcW w:type="dxa" w:w="1250"/>
             <w:tcMar>
               <w:top w:w="70" w:type="dxa"/>
-              <w:left w:w="120" w:type="dxa"/>
+              <w:start w:w="120" w:type="dxa"/>
               <w:bottom w:w="70" w:type="dxa"/>
-              <w:right w:w="120" w:type="dxa"/>
+              <w:end w:w="120" w:type="dxa"/>
             </w:tcMar>
             <w:vAlign w:val="center"/>
           </w:tcPr>
@@ -2209,10 +1727,10 @@
             <w:r/>
             <w:r>
               <w:rPr>
-                <w:rFonts w:ascii="Calibri" w:hAnsi="Calibri" w:eastAsia="ＭＳ 明朝" w:cs="Calibri" w:eastAsiaTheme="minorEastAsia" w:csTheme="minorBidi"/>
+                <w:rFonts w:ascii="Calibri" w:hAnsi="Calibri"/>
+                <w:b w:val="0"/>
                 <w:color w:val="182535"/>
                 <w:sz w:val="14"/>
-                <w:szCs w:val="22"/>
               </w:rPr>
               <w:t>0.0</w:t>
             </w:r>
@@ -2220,18 +1738,12 @@
         </w:tc>
         <w:tc>
           <w:tcPr>
-            <w:tcW w:w="2180" w:type="dxa"/>
-            <w:tcBorders>
-              <w:top w:val="single" w:sz="4" w:space="0" w:color="auto"/>
-              <w:left w:val="single" w:sz="4" w:space="0" w:color="auto"/>
-              <w:bottom w:val="single" w:sz="4" w:space="0" w:color="auto"/>
-              <w:right w:val="single" w:sz="4" w:space="0" w:color="auto"/>
-            </w:tcBorders>
+            <w:tcW w:type="dxa" w:w="2180"/>
             <w:tcMar>
               <w:top w:w="70" w:type="dxa"/>
-              <w:left w:w="120" w:type="dxa"/>
+              <w:start w:w="120" w:type="dxa"/>
               <w:bottom w:w="70" w:type="dxa"/>
-              <w:right w:w="120" w:type="dxa"/>
+              <w:end w:w="120" w:type="dxa"/>
             </w:tcMar>
             <w:vAlign w:val="center"/>
           </w:tcPr>
@@ -2243,10 +1755,10 @@
             <w:r/>
             <w:r>
               <w:rPr>
-                <w:rFonts w:ascii="Calibri" w:hAnsi="Calibri" w:eastAsia="ＭＳ 明朝" w:cs="Calibri" w:eastAsiaTheme="minorEastAsia" w:csTheme="minorBidi"/>
+                <w:rFonts w:ascii="Calibri" w:hAnsi="Calibri"/>
+                <w:b w:val="0"/>
                 <w:color w:val="182535"/>
                 <w:sz w:val="14"/>
-                <w:szCs w:val="22"/>
               </w:rPr>
               <w:t>0.106</w:t>
             </w:r>
@@ -2259,18 +1771,12 @@
         </w:trPr>
         <w:tc>
           <w:tcPr>
-            <w:tcW w:w="2200" w:type="dxa"/>
-            <w:tcBorders>
-              <w:top w:val="single" w:sz="4" w:space="0" w:color="auto"/>
-              <w:left w:val="single" w:sz="4" w:space="0" w:color="auto"/>
-              <w:bottom w:val="single" w:sz="4" w:space="0" w:color="auto"/>
-              <w:right w:val="single" w:sz="4" w:space="0" w:color="auto"/>
-            </w:tcBorders>
+            <w:tcW w:type="dxa" w:w="2200"/>
             <w:tcMar>
               <w:top w:w="70" w:type="dxa"/>
-              <w:left w:w="120" w:type="dxa"/>
+              <w:start w:w="120" w:type="dxa"/>
               <w:bottom w:w="70" w:type="dxa"/>
-              <w:right w:w="120" w:type="dxa"/>
+              <w:end w:w="120" w:type="dxa"/>
             </w:tcMar>
             <w:vAlign w:val="center"/>
           </w:tcPr>
@@ -2282,10 +1788,10 @@
             <w:r/>
             <w:r>
               <w:rPr>
-                <w:rFonts w:ascii="Calibri" w:hAnsi="Calibri" w:eastAsia="ＭＳ 明朝" w:cs="Calibri" w:eastAsiaTheme="minorEastAsia" w:csTheme="minorBidi"/>
+                <w:rFonts w:ascii="Calibri" w:hAnsi="Calibri"/>
+                <w:b w:val="0"/>
                 <w:color w:val="182535"/>
                 <w:sz w:val="14"/>
-                <w:szCs w:val="22"/>
               </w:rPr>
               <w:t>Paper restatement</w:t>
             </w:r>
@@ -2293,18 +1799,12 @@
         </w:tc>
         <w:tc>
           <w:tcPr>
-            <w:tcW w:w="850" w:type="dxa"/>
-            <w:tcBorders>
-              <w:top w:val="single" w:sz="4" w:space="0" w:color="auto"/>
-              <w:left w:val="single" w:sz="4" w:space="0" w:color="auto"/>
-              <w:bottom w:val="single" w:sz="4" w:space="0" w:color="auto"/>
-              <w:right w:val="single" w:sz="4" w:space="0" w:color="auto"/>
-            </w:tcBorders>
+            <w:tcW w:type="dxa" w:w="850"/>
             <w:tcMar>
               <w:top w:w="70" w:type="dxa"/>
-              <w:left w:w="120" w:type="dxa"/>
+              <w:start w:w="120" w:type="dxa"/>
               <w:bottom w:w="70" w:type="dxa"/>
-              <w:right w:w="120" w:type="dxa"/>
+              <w:end w:w="120" w:type="dxa"/>
             </w:tcMar>
             <w:vAlign w:val="center"/>
           </w:tcPr>
@@ -2316,10 +1816,10 @@
             <w:r/>
             <w:r>
               <w:rPr>
-                <w:rFonts w:ascii="Calibri" w:hAnsi="Calibri" w:eastAsia="ＭＳ 明朝" w:cs="Calibri" w:eastAsiaTheme="minorEastAsia" w:csTheme="minorBidi"/>
+                <w:rFonts w:ascii="Calibri" w:hAnsi="Calibri"/>
+                <w:b w:val="0"/>
                 <w:color w:val="182535"/>
                 <w:sz w:val="14"/>
-                <w:szCs w:val="22"/>
               </w:rPr>
               <w:t>13/15</w:t>
             </w:r>
@@ -2327,18 +1827,12 @@
         </w:tc>
         <w:tc>
           <w:tcPr>
-            <w:tcW w:w="1350" w:type="dxa"/>
-            <w:tcBorders>
-              <w:top w:val="single" w:sz="4" w:space="0" w:color="auto"/>
-              <w:left w:val="single" w:sz="4" w:space="0" w:color="auto"/>
-              <w:bottom w:val="single" w:sz="4" w:space="0" w:color="auto"/>
-              <w:right w:val="single" w:sz="4" w:space="0" w:color="auto"/>
-            </w:tcBorders>
+            <w:tcW w:type="dxa" w:w="1350"/>
             <w:tcMar>
               <w:top w:w="70" w:type="dxa"/>
-              <w:left w:w="120" w:type="dxa"/>
+              <w:start w:w="120" w:type="dxa"/>
               <w:bottom w:w="70" w:type="dxa"/>
-              <w:right w:w="120" w:type="dxa"/>
+              <w:end w:w="120" w:type="dxa"/>
             </w:tcMar>
             <w:vAlign w:val="center"/>
           </w:tcPr>
@@ -2350,10 +1844,10 @@
             <w:r/>
             <w:r>
               <w:rPr>
-                <w:rFonts w:ascii="Calibri" w:hAnsi="Calibri" w:eastAsia="ＭＳ 明朝" w:cs="Calibri" w:eastAsiaTheme="minorEastAsia" w:csTheme="minorBidi"/>
+                <w:rFonts w:ascii="Calibri" w:hAnsi="Calibri"/>
+                <w:b w:val="0"/>
                 <w:color w:val="182535"/>
                 <w:sz w:val="14"/>
-                <w:szCs w:val="22"/>
               </w:rPr>
               <w:t>8,631</w:t>
             </w:r>
@@ -2361,18 +1855,12 @@
         </w:tc>
         <w:tc>
           <w:tcPr>
-            <w:tcW w:w="1400" w:type="dxa"/>
-            <w:tcBorders>
-              <w:top w:val="single" w:sz="4" w:space="0" w:color="auto"/>
-              <w:left w:val="single" w:sz="4" w:space="0" w:color="auto"/>
-              <w:bottom w:val="single" w:sz="4" w:space="0" w:color="auto"/>
-              <w:right w:val="single" w:sz="4" w:space="0" w:color="auto"/>
-            </w:tcBorders>
+            <w:tcW w:type="dxa" w:w="1400"/>
             <w:tcMar>
               <w:top w:w="70" w:type="dxa"/>
-              <w:left w:w="120" w:type="dxa"/>
+              <w:start w:w="120" w:type="dxa"/>
               <w:bottom w:w="70" w:type="dxa"/>
-              <w:right w:w="120" w:type="dxa"/>
+              <w:end w:w="120" w:type="dxa"/>
             </w:tcMar>
             <w:vAlign w:val="center"/>
           </w:tcPr>
@@ -2384,10 +1872,10 @@
             <w:r/>
             <w:r>
               <w:rPr>
-                <w:rFonts w:ascii="Calibri" w:hAnsi="Calibri" w:eastAsia="ＭＳ 明朝" w:cs="Calibri" w:eastAsiaTheme="minorEastAsia" w:csTheme="minorBidi"/>
+                <w:rFonts w:ascii="Calibri" w:hAnsi="Calibri"/>
+                <w:b w:val="0"/>
                 <w:color w:val="182535"/>
                 <w:sz w:val="14"/>
-                <w:szCs w:val="22"/>
               </w:rPr>
               <w:t>5,460</w:t>
             </w:r>
@@ -2395,18 +1883,12 @@
         </w:tc>
         <w:tc>
           <w:tcPr>
-            <w:tcW w:w="850" w:type="dxa"/>
-            <w:tcBorders>
-              <w:top w:val="single" w:sz="4" w:space="0" w:color="auto"/>
-              <w:left w:val="single" w:sz="4" w:space="0" w:color="auto"/>
-              <w:bottom w:val="single" w:sz="4" w:space="0" w:color="auto"/>
-              <w:right w:val="single" w:sz="4" w:space="0" w:color="auto"/>
-            </w:tcBorders>
+            <w:tcW w:type="dxa" w:w="850"/>
             <w:tcMar>
               <w:top w:w="70" w:type="dxa"/>
-              <w:left w:w="120" w:type="dxa"/>
+              <w:start w:w="120" w:type="dxa"/>
               <w:bottom w:w="70" w:type="dxa"/>
-              <w:right w:w="120" w:type="dxa"/>
+              <w:end w:w="120" w:type="dxa"/>
             </w:tcMar>
             <w:vAlign w:val="center"/>
           </w:tcPr>
@@ -2418,10 +1900,10 @@
             <w:r/>
             <w:r>
               <w:rPr>
-                <w:rFonts w:ascii="Calibri" w:hAnsi="Calibri" w:eastAsia="ＭＳ 明朝" w:cs="Calibri" w:eastAsiaTheme="minorEastAsia" w:csTheme="minorBidi"/>
+                <w:rFonts w:ascii="Calibri" w:hAnsi="Calibri"/>
+                <w:b w:val="0"/>
                 <w:color w:val="182535"/>
                 <w:sz w:val="14"/>
-                <w:szCs w:val="22"/>
               </w:rPr>
               <w:t>4.87</w:t>
             </w:r>
@@ -2429,18 +1911,12 @@
         </w:tc>
         <w:tc>
           <w:tcPr>
-            <w:tcW w:w="1250" w:type="dxa"/>
-            <w:tcBorders>
-              <w:top w:val="single" w:sz="4" w:space="0" w:color="auto"/>
-              <w:left w:val="single" w:sz="4" w:space="0" w:color="auto"/>
-              <w:bottom w:val="single" w:sz="4" w:space="0" w:color="auto"/>
-              <w:right w:val="single" w:sz="4" w:space="0" w:color="auto"/>
-            </w:tcBorders>
+            <w:tcW w:type="dxa" w:w="1250"/>
             <w:tcMar>
               <w:top w:w="70" w:type="dxa"/>
-              <w:left w:w="120" w:type="dxa"/>
+              <w:start w:w="120" w:type="dxa"/>
               <w:bottom w:w="70" w:type="dxa"/>
-              <w:right w:w="120" w:type="dxa"/>
+              <w:end w:w="120" w:type="dxa"/>
             </w:tcMar>
             <w:vAlign w:val="center"/>
           </w:tcPr>
@@ -2452,10 +1928,10 @@
             <w:r/>
             <w:r>
               <w:rPr>
-                <w:rFonts w:ascii="Calibri" w:hAnsi="Calibri" w:eastAsia="ＭＳ 明朝" w:cs="Calibri" w:eastAsiaTheme="minorEastAsia" w:csTheme="minorBidi"/>
+                <w:rFonts w:ascii="Calibri" w:hAnsi="Calibri"/>
+                <w:b w:val="0"/>
                 <w:color w:val="182535"/>
                 <w:sz w:val="14"/>
-                <w:szCs w:val="22"/>
               </w:rPr>
               <w:t>1,227.7</w:t>
             </w:r>
@@ -2463,18 +1939,12 @@
         </w:tc>
         <w:tc>
           <w:tcPr>
-            <w:tcW w:w="2180" w:type="dxa"/>
-            <w:tcBorders>
-              <w:top w:val="single" w:sz="4" w:space="0" w:color="auto"/>
-              <w:left w:val="single" w:sz="4" w:space="0" w:color="auto"/>
-              <w:bottom w:val="single" w:sz="4" w:space="0" w:color="auto"/>
-              <w:right w:val="single" w:sz="4" w:space="0" w:color="auto"/>
-            </w:tcBorders>
+            <w:tcW w:type="dxa" w:w="2180"/>
             <w:tcMar>
               <w:top w:w="70" w:type="dxa"/>
-              <w:left w:w="120" w:type="dxa"/>
+              <w:start w:w="120" w:type="dxa"/>
               <w:bottom w:w="70" w:type="dxa"/>
-              <w:right w:w="120" w:type="dxa"/>
+              <w:end w:w="120" w:type="dxa"/>
             </w:tcMar>
             <w:vAlign w:val="center"/>
           </w:tcPr>
@@ -2486,10 +1956,10 @@
             <w:r/>
             <w:r>
               <w:rPr>
-                <w:rFonts w:ascii="Calibri" w:hAnsi="Calibri" w:eastAsia="ＭＳ 明朝" w:cs="Calibri" w:eastAsiaTheme="minorEastAsia" w:csTheme="minorBidi"/>
+                <w:rFonts w:ascii="Calibri" w:hAnsi="Calibri"/>
+                <w:b w:val="0"/>
                 <w:color w:val="182535"/>
                 <w:sz w:val="14"/>
-                <w:szCs w:val="22"/>
               </w:rPr>
               <w:t>0.100</w:t>
             </w:r>
@@ -2502,18 +1972,12 @@
         </w:trPr>
         <w:tc>
           <w:tcPr>
-            <w:tcW w:w="2200" w:type="dxa"/>
-            <w:tcBorders>
-              <w:top w:val="single" w:sz="4" w:space="0" w:color="auto"/>
-              <w:left w:val="single" w:sz="4" w:space="0" w:color="auto"/>
-              <w:bottom w:val="single" w:sz="4" w:space="0" w:color="auto"/>
-              <w:right w:val="single" w:sz="4" w:space="0" w:color="auto"/>
-            </w:tcBorders>
+            <w:tcW w:type="dxa" w:w="2200"/>
             <w:tcMar>
               <w:top w:w="70" w:type="dxa"/>
-              <w:left w:w="120" w:type="dxa"/>
+              <w:start w:w="120" w:type="dxa"/>
               <w:bottom w:w="70" w:type="dxa"/>
-              <w:right w:w="120" w:type="dxa"/>
+              <w:end w:w="120" w:type="dxa"/>
             </w:tcMar>
             <w:vAlign w:val="center"/>
           </w:tcPr>
@@ -2525,10 +1989,10 @@
             <w:r/>
             <w:r>
               <w:rPr>
-                <w:rFonts w:ascii="Calibri" w:hAnsi="Calibri" w:eastAsia="ＭＳ 明朝" w:cs="Calibri" w:eastAsiaTheme="minorEastAsia" w:csTheme="minorBidi"/>
+                <w:rFonts w:ascii="Calibri" w:hAnsi="Calibri"/>
+                <w:b w:val="0"/>
                 <w:color w:val="182535"/>
                 <w:sz w:val="14"/>
-                <w:szCs w:val="22"/>
               </w:rPr>
               <w:t>JSON state</w:t>
             </w:r>
@@ -2536,18 +2000,12 @@
         </w:tc>
         <w:tc>
           <w:tcPr>
-            <w:tcW w:w="850" w:type="dxa"/>
-            <w:tcBorders>
-              <w:top w:val="single" w:sz="4" w:space="0" w:color="auto"/>
-              <w:left w:val="single" w:sz="4" w:space="0" w:color="auto"/>
-              <w:bottom w:val="single" w:sz="4" w:space="0" w:color="auto"/>
-              <w:right w:val="single" w:sz="4" w:space="0" w:color="auto"/>
-            </w:tcBorders>
+            <w:tcW w:type="dxa" w:w="850"/>
             <w:tcMar>
               <w:top w:w="70" w:type="dxa"/>
-              <w:left w:w="120" w:type="dxa"/>
+              <w:start w:w="120" w:type="dxa"/>
               <w:bottom w:w="70" w:type="dxa"/>
-              <w:right w:w="120" w:type="dxa"/>
+              <w:end w:w="120" w:type="dxa"/>
             </w:tcMar>
             <w:vAlign w:val="center"/>
           </w:tcPr>
@@ -2559,10 +2017,10 @@
             <w:r/>
             <w:r>
               <w:rPr>
-                <w:rFonts w:ascii="Calibri" w:hAnsi="Calibri" w:eastAsia="ＭＳ 明朝" w:cs="Calibri" w:eastAsiaTheme="minorEastAsia" w:csTheme="minorBidi"/>
+                <w:rFonts w:ascii="Calibri" w:hAnsi="Calibri"/>
+                <w:b w:val="0"/>
                 <w:color w:val="182535"/>
                 <w:sz w:val="14"/>
-                <w:szCs w:val="22"/>
               </w:rPr>
               <w:t>15/15</w:t>
             </w:r>
@@ -2570,18 +2028,12 @@
         </w:tc>
         <w:tc>
           <w:tcPr>
-            <w:tcW w:w="1350" w:type="dxa"/>
-            <w:tcBorders>
-              <w:top w:val="single" w:sz="4" w:space="0" w:color="auto"/>
-              <w:left w:val="single" w:sz="4" w:space="0" w:color="auto"/>
-              <w:bottom w:val="single" w:sz="4" w:space="0" w:color="auto"/>
-              <w:right w:val="single" w:sz="4" w:space="0" w:color="auto"/>
-            </w:tcBorders>
+            <w:tcW w:type="dxa" w:w="1350"/>
             <w:tcMar>
               <w:top w:w="70" w:type="dxa"/>
-              <w:left w:w="120" w:type="dxa"/>
+              <w:start w:w="120" w:type="dxa"/>
               <w:bottom w:w="70" w:type="dxa"/>
-              <w:right w:w="120" w:type="dxa"/>
+              <w:end w:w="120" w:type="dxa"/>
             </w:tcMar>
             <w:vAlign w:val="center"/>
           </w:tcPr>
@@ -2593,10 +2045,10 @@
             <w:r/>
             <w:r>
               <w:rPr>
-                <w:rFonts w:ascii="Calibri" w:hAnsi="Calibri" w:eastAsia="ＭＳ 明朝" w:cs="Calibri" w:eastAsiaTheme="minorEastAsia" w:csTheme="minorBidi"/>
+                <w:rFonts w:ascii="Calibri" w:hAnsi="Calibri"/>
+                <w:b w:val="0"/>
                 <w:color w:val="182535"/>
                 <w:sz w:val="14"/>
-                <w:szCs w:val="22"/>
               </w:rPr>
               <w:t>8,887</w:t>
             </w:r>
@@ -2604,18 +2056,12 @@
         </w:tc>
         <w:tc>
           <w:tcPr>
-            <w:tcW w:w="1400" w:type="dxa"/>
-            <w:tcBorders>
-              <w:top w:val="single" w:sz="4" w:space="0" w:color="auto"/>
-              <w:left w:val="single" w:sz="4" w:space="0" w:color="auto"/>
-              <w:bottom w:val="single" w:sz="4" w:space="0" w:color="auto"/>
-              <w:right w:val="single" w:sz="4" w:space="0" w:color="auto"/>
-            </w:tcBorders>
+            <w:tcW w:type="dxa" w:w="1400"/>
             <w:tcMar>
               <w:top w:w="70" w:type="dxa"/>
-              <w:left w:w="120" w:type="dxa"/>
+              <w:start w:w="120" w:type="dxa"/>
               <w:bottom w:w="70" w:type="dxa"/>
-              <w:right w:w="120" w:type="dxa"/>
+              <w:end w:w="120" w:type="dxa"/>
             </w:tcMar>
             <w:vAlign w:val="center"/>
           </w:tcPr>
@@ -2627,10 +2073,10 @@
             <w:r/>
             <w:r>
               <w:rPr>
-                <w:rFonts w:ascii="Calibri" w:hAnsi="Calibri" w:eastAsia="ＭＳ 明朝" w:cs="Calibri" w:eastAsiaTheme="minorEastAsia" w:csTheme="minorBidi"/>
+                <w:rFonts w:ascii="Calibri" w:hAnsi="Calibri"/>
+                <w:b w:val="0"/>
                 <w:color w:val="182535"/>
                 <w:sz w:val="14"/>
-                <w:szCs w:val="22"/>
               </w:rPr>
               <w:t>5,780</w:t>
             </w:r>
@@ -2638,18 +2084,12 @@
         </w:tc>
         <w:tc>
           <w:tcPr>
-            <w:tcW w:w="850" w:type="dxa"/>
-            <w:tcBorders>
-              <w:top w:val="single" w:sz="4" w:space="0" w:color="auto"/>
-              <w:left w:val="single" w:sz="4" w:space="0" w:color="auto"/>
-              <w:bottom w:val="single" w:sz="4" w:space="0" w:color="auto"/>
-              <w:right w:val="single" w:sz="4" w:space="0" w:color="auto"/>
-            </w:tcBorders>
+            <w:tcW w:type="dxa" w:w="850"/>
             <w:tcMar>
               <w:top w:w="70" w:type="dxa"/>
-              <w:left w:w="120" w:type="dxa"/>
+              <w:start w:w="120" w:type="dxa"/>
               <w:bottom w:w="70" w:type="dxa"/>
-              <w:right w:w="120" w:type="dxa"/>
+              <w:end w:w="120" w:type="dxa"/>
             </w:tcMar>
             <w:vAlign w:val="center"/>
           </w:tcPr>
@@ -2661,10 +2101,10 @@
             <w:r/>
             <w:r>
               <w:rPr>
-                <w:rFonts w:ascii="Calibri" w:hAnsi="Calibri" w:eastAsia="ＭＳ 明朝" w:cs="Calibri" w:eastAsiaTheme="minorEastAsia" w:csTheme="minorBidi"/>
+                <w:rFonts w:ascii="Calibri" w:hAnsi="Calibri"/>
+                <w:b w:val="0"/>
                 <w:color w:val="182535"/>
                 <w:sz w:val="14"/>
-                <w:szCs w:val="22"/>
               </w:rPr>
               <w:t>5.27</w:t>
             </w:r>
@@ -2672,18 +2112,12 @@
         </w:tc>
         <w:tc>
           <w:tcPr>
-            <w:tcW w:w="1250" w:type="dxa"/>
-            <w:tcBorders>
-              <w:top w:val="single" w:sz="4" w:space="0" w:color="auto"/>
-              <w:left w:val="single" w:sz="4" w:space="0" w:color="auto"/>
-              <w:bottom w:val="single" w:sz="4" w:space="0" w:color="auto"/>
-              <w:right w:val="single" w:sz="4" w:space="0" w:color="auto"/>
-            </w:tcBorders>
+            <w:tcW w:type="dxa" w:w="1250"/>
             <w:tcMar>
               <w:top w:w="70" w:type="dxa"/>
-              <w:left w:w="120" w:type="dxa"/>
+              <w:start w:w="120" w:type="dxa"/>
               <w:bottom w:w="70" w:type="dxa"/>
-              <w:right w:w="120" w:type="dxa"/>
+              <w:end w:w="120" w:type="dxa"/>
             </w:tcMar>
             <w:vAlign w:val="center"/>
           </w:tcPr>
@@ -2695,10 +2129,10 @@
             <w:r/>
             <w:r>
               <w:rPr>
-                <w:rFonts w:ascii="Calibri" w:hAnsi="Calibri" w:eastAsia="ＭＳ 明朝" w:cs="Calibri" w:eastAsiaTheme="minorEastAsia" w:csTheme="minorBidi"/>
+                <w:rFonts w:ascii="Calibri" w:hAnsi="Calibri"/>
+                <w:b w:val="0"/>
                 <w:color w:val="182535"/>
                 <w:sz w:val="14"/>
-                <w:szCs w:val="22"/>
               </w:rPr>
               <w:t>404.7</w:t>
             </w:r>
@@ -2706,18 +2140,12 @@
         </w:tc>
         <w:tc>
           <w:tcPr>
-            <w:tcW w:w="2180" w:type="dxa"/>
-            <w:tcBorders>
-              <w:top w:val="single" w:sz="4" w:space="0" w:color="auto"/>
-              <w:left w:val="single" w:sz="4" w:space="0" w:color="auto"/>
-              <w:bottom w:val="single" w:sz="4" w:space="0" w:color="auto"/>
-              <w:right w:val="single" w:sz="4" w:space="0" w:color="auto"/>
-            </w:tcBorders>
+            <w:tcW w:type="dxa" w:w="2180"/>
             <w:tcMar>
               <w:top w:w="70" w:type="dxa"/>
-              <w:left w:w="120" w:type="dxa"/>
+              <w:start w:w="120" w:type="dxa"/>
               <w:bottom w:w="70" w:type="dxa"/>
-              <w:right w:w="120" w:type="dxa"/>
+              <w:end w:w="120" w:type="dxa"/>
             </w:tcMar>
             <w:vAlign w:val="center"/>
           </w:tcPr>
@@ -2729,10 +2157,10 @@
             <w:r/>
             <w:r>
               <w:rPr>
-                <w:rFonts w:ascii="Calibri" w:hAnsi="Calibri" w:eastAsia="ＭＳ 明朝" w:cs="Calibri" w:eastAsiaTheme="minorEastAsia" w:csTheme="minorBidi"/>
+                <w:rFonts w:ascii="Calibri" w:hAnsi="Calibri"/>
+                <w:b w:val="0"/>
                 <w:color w:val="182535"/>
                 <w:sz w:val="14"/>
-                <w:szCs w:val="22"/>
               </w:rPr>
               <w:t>0.113</w:t>
             </w:r>
@@ -2745,18 +2173,12 @@
         </w:trPr>
         <w:tc>
           <w:tcPr>
-            <w:tcW w:w="2200" w:type="dxa"/>
-            <w:tcBorders>
-              <w:top w:val="single" w:sz="4" w:space="0" w:color="auto"/>
-              <w:left w:val="single" w:sz="4" w:space="0" w:color="auto"/>
-              <w:bottom w:val="single" w:sz="4" w:space="0" w:color="auto"/>
-              <w:right w:val="single" w:sz="4" w:space="0" w:color="auto"/>
-            </w:tcBorders>
+            <w:tcW w:type="dxa" w:w="2200"/>
             <w:tcMar>
               <w:top w:w="70" w:type="dxa"/>
-              <w:left w:w="120" w:type="dxa"/>
+              <w:start w:w="120" w:type="dxa"/>
               <w:bottom w:w="70" w:type="dxa"/>
-              <w:right w:w="120" w:type="dxa"/>
+              <w:end w:w="120" w:type="dxa"/>
             </w:tcMar>
             <w:vAlign w:val="center"/>
           </w:tcPr>
@@ -2768,29 +2190,23 @@
             <w:r/>
             <w:r>
               <w:rPr>
-                <w:rFonts w:ascii="Calibri" w:hAnsi="Calibri" w:eastAsia="ＭＳ 明朝" w:cs="Calibri" w:eastAsiaTheme="minorEastAsia" w:csTheme="minorBidi"/>
+                <w:rFonts w:ascii="Calibri" w:hAnsi="Calibri"/>
+                <w:b w:val="0"/>
                 <w:color w:val="182535"/>
                 <w:sz w:val="14"/>
-                <w:szCs w:val="22"/>
               </w:rPr>
-              <w:t>Dependency pruning</w:t>
+              <w:t>Static dependency pruning</w:t>
             </w:r>
           </w:p>
         </w:tc>
         <w:tc>
           <w:tcPr>
-            <w:tcW w:w="850" w:type="dxa"/>
-            <w:tcBorders>
-              <w:top w:val="single" w:sz="4" w:space="0" w:color="auto"/>
-              <w:left w:val="single" w:sz="4" w:space="0" w:color="auto"/>
-              <w:bottom w:val="single" w:sz="4" w:space="0" w:color="auto"/>
-              <w:right w:val="single" w:sz="4" w:space="0" w:color="auto"/>
-            </w:tcBorders>
+            <w:tcW w:type="dxa" w:w="850"/>
             <w:tcMar>
               <w:top w:w="70" w:type="dxa"/>
-              <w:left w:w="120" w:type="dxa"/>
+              <w:start w:w="120" w:type="dxa"/>
               <w:bottom w:w="70" w:type="dxa"/>
-              <w:right w:w="120" w:type="dxa"/>
+              <w:end w:w="120" w:type="dxa"/>
             </w:tcMar>
             <w:vAlign w:val="center"/>
           </w:tcPr>
@@ -2802,10 +2218,10 @@
             <w:r/>
             <w:r>
               <w:rPr>
-                <w:rFonts w:ascii="Calibri" w:hAnsi="Calibri" w:eastAsia="ＭＳ 明朝" w:cs="Calibri" w:eastAsiaTheme="minorEastAsia" w:csTheme="minorBidi"/>
+                <w:rFonts w:ascii="Calibri" w:hAnsi="Calibri"/>
+                <w:b w:val="0"/>
                 <w:color w:val="182535"/>
                 <w:sz w:val="14"/>
-                <w:szCs w:val="22"/>
               </w:rPr>
               <w:t>15/15</w:t>
             </w:r>
@@ -2813,18 +2229,12 @@
         </w:tc>
         <w:tc>
           <w:tcPr>
-            <w:tcW w:w="1350" w:type="dxa"/>
-            <w:tcBorders>
-              <w:top w:val="single" w:sz="4" w:space="0" w:color="auto"/>
-              <w:left w:val="single" w:sz="4" w:space="0" w:color="auto"/>
-              <w:bottom w:val="single" w:sz="4" w:space="0" w:color="auto"/>
-              <w:right w:val="single" w:sz="4" w:space="0" w:color="auto"/>
-            </w:tcBorders>
+            <w:tcW w:type="dxa" w:w="1350"/>
             <w:tcMar>
               <w:top w:w="70" w:type="dxa"/>
-              <w:left w:w="120" w:type="dxa"/>
+              <w:start w:w="120" w:type="dxa"/>
               <w:bottom w:w="70" w:type="dxa"/>
-              <w:right w:w="120" w:type="dxa"/>
+              <w:end w:w="120" w:type="dxa"/>
             </w:tcMar>
             <w:vAlign w:val="center"/>
           </w:tcPr>
@@ -2836,10 +2246,10 @@
             <w:r/>
             <w:r>
               <w:rPr>
-                <w:rFonts w:ascii="Calibri" w:hAnsi="Calibri" w:eastAsia="ＭＳ 明朝" w:cs="Calibri" w:eastAsiaTheme="minorEastAsia" w:csTheme="minorBidi"/>
+                <w:rFonts w:ascii="Calibri" w:hAnsi="Calibri"/>
+                <w:b w:val="0"/>
                 <w:color w:val="182535"/>
                 <w:sz w:val="14"/>
-                <w:szCs w:val="22"/>
               </w:rPr>
               <w:t>8,744</w:t>
             </w:r>
@@ -2847,18 +2257,12 @@
         </w:tc>
         <w:tc>
           <w:tcPr>
-            <w:tcW w:w="1400" w:type="dxa"/>
-            <w:tcBorders>
-              <w:top w:val="single" w:sz="4" w:space="0" w:color="auto"/>
-              <w:left w:val="single" w:sz="4" w:space="0" w:color="auto"/>
-              <w:bottom w:val="single" w:sz="4" w:space="0" w:color="auto"/>
-              <w:right w:val="single" w:sz="4" w:space="0" w:color="auto"/>
-            </w:tcBorders>
+            <w:tcW w:type="dxa" w:w="1400"/>
             <w:tcMar>
               <w:top w:w="70" w:type="dxa"/>
-              <w:left w:w="120" w:type="dxa"/>
+              <w:start w:w="120" w:type="dxa"/>
               <w:bottom w:w="70" w:type="dxa"/>
-              <w:right w:w="120" w:type="dxa"/>
+              <w:end w:w="120" w:type="dxa"/>
             </w:tcMar>
             <w:vAlign w:val="center"/>
           </w:tcPr>
@@ -2870,10 +2274,10 @@
             <w:r/>
             <w:r>
               <w:rPr>
-                <w:rFonts w:ascii="Calibri" w:hAnsi="Calibri" w:eastAsia="ＭＳ 明朝" w:cs="Calibri" w:eastAsiaTheme="minorEastAsia" w:csTheme="minorBidi"/>
+                <w:rFonts w:ascii="Calibri" w:hAnsi="Calibri"/>
+                <w:b w:val="0"/>
                 <w:color w:val="182535"/>
                 <w:sz w:val="14"/>
-                <w:szCs w:val="22"/>
               </w:rPr>
               <w:t>5,542</w:t>
             </w:r>
@@ -2881,18 +2285,12 @@
         </w:tc>
         <w:tc>
           <w:tcPr>
-            <w:tcW w:w="850" w:type="dxa"/>
-            <w:tcBorders>
-              <w:top w:val="single" w:sz="4" w:space="0" w:color="auto"/>
-              <w:left w:val="single" w:sz="4" w:space="0" w:color="auto"/>
-              <w:bottom w:val="single" w:sz="4" w:space="0" w:color="auto"/>
-              <w:right w:val="single" w:sz="4" w:space="0" w:color="auto"/>
-            </w:tcBorders>
+            <w:tcW w:type="dxa" w:w="850"/>
             <w:tcMar>
               <w:top w:w="70" w:type="dxa"/>
-              <w:left w:w="120" w:type="dxa"/>
+              <w:start w:w="120" w:type="dxa"/>
               <w:bottom w:w="70" w:type="dxa"/>
-              <w:right w:w="120" w:type="dxa"/>
+              <w:end w:w="120" w:type="dxa"/>
             </w:tcMar>
             <w:vAlign w:val="center"/>
           </w:tcPr>
@@ -2904,10 +2302,10 @@
             <w:r/>
             <w:r>
               <w:rPr>
-                <w:rFonts w:ascii="Calibri" w:hAnsi="Calibri" w:eastAsia="ＭＳ 明朝" w:cs="Calibri" w:eastAsiaTheme="minorEastAsia" w:csTheme="minorBidi"/>
+                <w:rFonts w:ascii="Calibri" w:hAnsi="Calibri"/>
+                <w:b w:val="0"/>
                 <w:color w:val="182535"/>
                 <w:sz w:val="14"/>
-                <w:szCs w:val="22"/>
               </w:rPr>
               <w:t>5.20</w:t>
             </w:r>
@@ -2915,18 +2313,12 @@
         </w:tc>
         <w:tc>
           <w:tcPr>
-            <w:tcW w:w="1250" w:type="dxa"/>
-            <w:tcBorders>
-              <w:top w:val="single" w:sz="4" w:space="0" w:color="auto"/>
-              <w:left w:val="single" w:sz="4" w:space="0" w:color="auto"/>
-              <w:bottom w:val="single" w:sz="4" w:space="0" w:color="auto"/>
-              <w:right w:val="single" w:sz="4" w:space="0" w:color="auto"/>
-            </w:tcBorders>
+            <w:tcW w:type="dxa" w:w="1250"/>
             <w:tcMar>
               <w:top w:w="70" w:type="dxa"/>
-              <w:left w:w="120" w:type="dxa"/>
+              <w:start w:w="120" w:type="dxa"/>
               <w:bottom w:w="70" w:type="dxa"/>
-              <w:right w:w="120" w:type="dxa"/>
+              <w:end w:w="120" w:type="dxa"/>
             </w:tcMar>
             <w:vAlign w:val="center"/>
           </w:tcPr>
@@ -2938,10 +2330,10 @@
             <w:r/>
             <w:r>
               <w:rPr>
-                <w:rFonts w:ascii="Calibri" w:hAnsi="Calibri" w:eastAsia="ＭＳ 明朝" w:cs="Calibri" w:eastAsiaTheme="minorEastAsia" w:csTheme="minorBidi"/>
+                <w:rFonts w:ascii="Calibri" w:hAnsi="Calibri"/>
+                <w:b w:val="0"/>
                 <w:color w:val="182535"/>
                 <w:sz w:val="14"/>
-                <w:szCs w:val="22"/>
               </w:rPr>
               <w:t>404.7</w:t>
             </w:r>
@@ -2949,18 +2341,12 @@
         </w:tc>
         <w:tc>
           <w:tcPr>
-            <w:tcW w:w="2180" w:type="dxa"/>
-            <w:tcBorders>
-              <w:top w:val="single" w:sz="4" w:space="0" w:color="auto"/>
-              <w:left w:val="single" w:sz="4" w:space="0" w:color="auto"/>
-              <w:bottom w:val="single" w:sz="4" w:space="0" w:color="auto"/>
-              <w:right w:val="single" w:sz="4" w:space="0" w:color="auto"/>
-            </w:tcBorders>
+            <w:tcW w:type="dxa" w:w="2180"/>
             <w:tcMar>
               <w:top w:w="70" w:type="dxa"/>
-              <w:left w:w="120" w:type="dxa"/>
+              <w:start w:w="120" w:type="dxa"/>
               <w:bottom w:w="70" w:type="dxa"/>
-              <w:right w:w="120" w:type="dxa"/>
+              <w:end w:w="120" w:type="dxa"/>
             </w:tcMar>
             <w:vAlign w:val="center"/>
           </w:tcPr>
@@ -2972,10 +2358,10 @@
             <w:r/>
             <w:r>
               <w:rPr>
-                <w:rFonts w:ascii="Calibri" w:hAnsi="Calibri" w:eastAsia="ＭＳ 明朝" w:cs="Calibri" w:eastAsiaTheme="minorEastAsia" w:csTheme="minorBidi"/>
+                <w:rFonts w:ascii="Calibri" w:hAnsi="Calibri"/>
+                <w:b w:val="0"/>
                 <w:color w:val="182535"/>
                 <w:sz w:val="14"/>
-                <w:szCs w:val="22"/>
               </w:rPr>
               <w:t>0.114</w:t>
             </w:r>
@@ -2988,18 +2374,12 @@
         </w:trPr>
         <w:tc>
           <w:tcPr>
-            <w:tcW w:w="2200" w:type="dxa"/>
-            <w:tcBorders>
-              <w:top w:val="single" w:sz="4" w:space="0" w:color="auto"/>
-              <w:left w:val="single" w:sz="4" w:space="0" w:color="auto"/>
-              <w:bottom w:val="single" w:sz="4" w:space="0" w:color="auto"/>
-              <w:right w:val="single" w:sz="4" w:space="0" w:color="auto"/>
-            </w:tcBorders>
+            <w:tcW w:type="dxa" w:w="2200"/>
             <w:tcMar>
               <w:top w:w="70" w:type="dxa"/>
-              <w:left w:w="120" w:type="dxa"/>
+              <w:start w:w="120" w:type="dxa"/>
               <w:bottom w:w="70" w:type="dxa"/>
-              <w:right w:w="120" w:type="dxa"/>
+              <w:end w:w="120" w:type="dxa"/>
             </w:tcMar>
             <w:vAlign w:val="center"/>
           </w:tcPr>
@@ -3011,10 +2391,10 @@
             <w:r/>
             <w:r>
               <w:rPr>
-                <w:rFonts w:ascii="Calibri" w:hAnsi="Calibri" w:eastAsia="ＭＳ 明朝" w:cs="Calibri" w:eastAsiaTheme="minorEastAsia" w:csTheme="minorBidi"/>
+                <w:rFonts w:ascii="Calibri" w:hAnsi="Calibri"/>
+                <w:b w:val="0"/>
                 <w:color w:val="182535"/>
                 <w:sz w:val="14"/>
-                <w:szCs w:val="22"/>
               </w:rPr>
               <w:t>Live dependency pruning</w:t>
             </w:r>
@@ -3022,18 +2402,12 @@
         </w:tc>
         <w:tc>
           <w:tcPr>
-            <w:tcW w:w="850" w:type="dxa"/>
-            <w:tcBorders>
-              <w:top w:val="single" w:sz="4" w:space="0" w:color="auto"/>
-              <w:left w:val="single" w:sz="4" w:space="0" w:color="auto"/>
-              <w:bottom w:val="single" w:sz="4" w:space="0" w:color="auto"/>
-              <w:right w:val="single" w:sz="4" w:space="0" w:color="auto"/>
-            </w:tcBorders>
+            <w:tcW w:type="dxa" w:w="850"/>
             <w:tcMar>
               <w:top w:w="70" w:type="dxa"/>
-              <w:left w:w="120" w:type="dxa"/>
+              <w:start w:w="120" w:type="dxa"/>
               <w:bottom w:w="70" w:type="dxa"/>
-              <w:right w:w="120" w:type="dxa"/>
+              <w:end w:w="120" w:type="dxa"/>
             </w:tcMar>
             <w:vAlign w:val="center"/>
           </w:tcPr>
@@ -3045,10 +2419,10 @@
             <w:r/>
             <w:r>
               <w:rPr>
-                <w:rFonts w:ascii="Calibri" w:hAnsi="Calibri" w:eastAsia="ＭＳ 明朝" w:cs="Calibri" w:eastAsiaTheme="minorEastAsia" w:csTheme="minorBidi"/>
+                <w:rFonts w:ascii="Calibri" w:hAnsi="Calibri"/>
+                <w:b w:val="0"/>
                 <w:color w:val="182535"/>
                 <w:sz w:val="14"/>
-                <w:szCs w:val="22"/>
               </w:rPr>
               <w:t>13/15</w:t>
             </w:r>
@@ -3056,18 +2430,12 @@
         </w:tc>
         <w:tc>
           <w:tcPr>
-            <w:tcW w:w="1350" w:type="dxa"/>
-            <w:tcBorders>
-              <w:top w:val="single" w:sz="4" w:space="0" w:color="auto"/>
-              <w:left w:val="single" w:sz="4" w:space="0" w:color="auto"/>
-              <w:bottom w:val="single" w:sz="4" w:space="0" w:color="auto"/>
-              <w:right w:val="single" w:sz="4" w:space="0" w:color="auto"/>
-            </w:tcBorders>
+            <w:tcW w:type="dxa" w:w="1350"/>
             <w:tcMar>
               <w:top w:w="70" w:type="dxa"/>
-              <w:left w:w="120" w:type="dxa"/>
+              <w:start w:w="120" w:type="dxa"/>
               <w:bottom w:w="70" w:type="dxa"/>
-              <w:right w:w="120" w:type="dxa"/>
+              <w:end w:w="120" w:type="dxa"/>
             </w:tcMar>
             <w:vAlign w:val="center"/>
           </w:tcPr>
@@ -3079,10 +2447,10 @@
             <w:r/>
             <w:r>
               <w:rPr>
-                <w:rFonts w:ascii="Calibri" w:hAnsi="Calibri" w:eastAsia="ＭＳ 明朝" w:cs="Calibri" w:eastAsiaTheme="minorEastAsia" w:csTheme="minorBidi"/>
+                <w:rFonts w:ascii="Calibri" w:hAnsi="Calibri"/>
+                <w:b w:val="0"/>
                 <w:color w:val="182535"/>
                 <w:sz w:val="14"/>
-                <w:szCs w:val="22"/>
               </w:rPr>
               <w:t>7,484</w:t>
             </w:r>
@@ -3090,18 +2458,12 @@
         </w:tc>
         <w:tc>
           <w:tcPr>
-            <w:tcW w:w="1400" w:type="dxa"/>
-            <w:tcBorders>
-              <w:top w:val="single" w:sz="4" w:space="0" w:color="auto"/>
-              <w:left w:val="single" w:sz="4" w:space="0" w:color="auto"/>
-              <w:bottom w:val="single" w:sz="4" w:space="0" w:color="auto"/>
-              <w:right w:val="single" w:sz="4" w:space="0" w:color="auto"/>
-            </w:tcBorders>
+            <w:tcW w:type="dxa" w:w="1400"/>
             <w:tcMar>
               <w:top w:w="70" w:type="dxa"/>
-              <w:left w:w="120" w:type="dxa"/>
+              <w:start w:w="120" w:type="dxa"/>
               <w:bottom w:w="70" w:type="dxa"/>
-              <w:right w:w="120" w:type="dxa"/>
+              <w:end w:w="120" w:type="dxa"/>
             </w:tcMar>
             <w:vAlign w:val="center"/>
           </w:tcPr>
@@ -3113,10 +2475,10 @@
             <w:r/>
             <w:r>
               <w:rPr>
-                <w:rFonts w:ascii="Calibri" w:hAnsi="Calibri" w:eastAsia="ＭＳ 明朝" w:cs="Calibri" w:eastAsiaTheme="minorEastAsia" w:csTheme="minorBidi"/>
+                <w:rFonts w:ascii="Calibri" w:hAnsi="Calibri"/>
+                <w:b w:val="0"/>
                 <w:color w:val="182535"/>
                 <w:sz w:val="14"/>
-                <w:szCs w:val="22"/>
               </w:rPr>
               <w:t>5,297</w:t>
             </w:r>
@@ -3124,18 +2486,12 @@
         </w:tc>
         <w:tc>
           <w:tcPr>
-            <w:tcW w:w="850" w:type="dxa"/>
-            <w:tcBorders>
-              <w:top w:val="single" w:sz="4" w:space="0" w:color="auto"/>
-              <w:left w:val="single" w:sz="4" w:space="0" w:color="auto"/>
-              <w:bottom w:val="single" w:sz="4" w:space="0" w:color="auto"/>
-              <w:right w:val="single" w:sz="4" w:space="0" w:color="auto"/>
-            </w:tcBorders>
+            <w:tcW w:type="dxa" w:w="850"/>
             <w:tcMar>
               <w:top w:w="70" w:type="dxa"/>
-              <w:left w:w="120" w:type="dxa"/>
+              <w:start w:w="120" w:type="dxa"/>
               <w:bottom w:w="70" w:type="dxa"/>
-              <w:right w:w="120" w:type="dxa"/>
+              <w:end w:w="120" w:type="dxa"/>
             </w:tcMar>
             <w:vAlign w:val="center"/>
           </w:tcPr>
@@ -3147,10 +2503,10 @@
             <w:r/>
             <w:r>
               <w:rPr>
-                <w:rFonts w:ascii="Calibri" w:hAnsi="Calibri" w:eastAsia="ＭＳ 明朝" w:cs="Calibri" w:eastAsiaTheme="minorEastAsia" w:csTheme="minorBidi"/>
+                <w:rFonts w:ascii="Calibri" w:hAnsi="Calibri"/>
+                <w:b w:val="0"/>
                 <w:color w:val="182535"/>
                 <w:sz w:val="14"/>
-                <w:szCs w:val="22"/>
               </w:rPr>
               <w:t>4.67</w:t>
             </w:r>
@@ -3158,18 +2514,12 @@
         </w:tc>
         <w:tc>
           <w:tcPr>
-            <w:tcW w:w="1250" w:type="dxa"/>
-            <w:tcBorders>
-              <w:top w:val="single" w:sz="4" w:space="0" w:color="auto"/>
-              <w:left w:val="single" w:sz="4" w:space="0" w:color="auto"/>
-              <w:bottom w:val="single" w:sz="4" w:space="0" w:color="auto"/>
-              <w:right w:val="single" w:sz="4" w:space="0" w:color="auto"/>
-            </w:tcBorders>
+            <w:tcW w:type="dxa" w:w="1250"/>
             <w:tcMar>
               <w:top w:w="70" w:type="dxa"/>
-              <w:left w:w="120" w:type="dxa"/>
+              <w:start w:w="120" w:type="dxa"/>
               <w:bottom w:w="70" w:type="dxa"/>
-              <w:right w:w="120" w:type="dxa"/>
+              <w:end w:w="120" w:type="dxa"/>
             </w:tcMar>
             <w:vAlign w:val="center"/>
           </w:tcPr>
@@ -3181,10 +2531,10 @@
             <w:r/>
             <w:r>
               <w:rPr>
-                <w:rFonts w:ascii="Calibri" w:hAnsi="Calibri" w:eastAsia="ＭＳ 明朝" w:cs="Calibri" w:eastAsiaTheme="minorEastAsia" w:csTheme="minorBidi"/>
+                <w:rFonts w:ascii="Calibri" w:hAnsi="Calibri"/>
+                <w:b w:val="0"/>
                 <w:color w:val="182535"/>
                 <w:sz w:val="14"/>
-                <w:szCs w:val="22"/>
               </w:rPr>
               <w:t>156.9</w:t>
             </w:r>
@@ -3192,18 +2542,12 @@
         </w:tc>
         <w:tc>
           <w:tcPr>
-            <w:tcW w:w="2180" w:type="dxa"/>
-            <w:tcBorders>
-              <w:top w:val="single" w:sz="4" w:space="0" w:color="auto"/>
-              <w:left w:val="single" w:sz="4" w:space="0" w:color="auto"/>
-              <w:bottom w:val="single" w:sz="4" w:space="0" w:color="auto"/>
-              <w:right w:val="single" w:sz="4" w:space="0" w:color="auto"/>
-            </w:tcBorders>
+            <w:tcW w:type="dxa" w:w="2180"/>
             <w:tcMar>
               <w:top w:w="70" w:type="dxa"/>
-              <w:left w:w="120" w:type="dxa"/>
+              <w:start w:w="120" w:type="dxa"/>
               <w:bottom w:w="70" w:type="dxa"/>
-              <w:right w:w="120" w:type="dxa"/>
+              <w:end w:w="120" w:type="dxa"/>
             </w:tcMar>
             <w:vAlign w:val="center"/>
           </w:tcPr>
@@ -3215,10 +2559,10 @@
             <w:r/>
             <w:r>
               <w:rPr>
-                <w:rFonts w:ascii="Calibri" w:hAnsi="Calibri" w:eastAsia="ＭＳ 明朝" w:cs="Calibri" w:eastAsiaTheme="minorEastAsia" w:csTheme="minorBidi"/>
+                <w:rFonts w:ascii="Calibri" w:hAnsi="Calibri"/>
+                <w:b w:val="0"/>
                 <w:color w:val="182535"/>
                 <w:sz w:val="14"/>
-                <w:szCs w:val="22"/>
               </w:rPr>
               <w:t>0.116</w:t>
             </w:r>
@@ -3232,16 +2576,6 @@
         <w:jc w:val="center"/>
       </w:pPr>
       <w:r>
-        <w:rPr>
-          <w:rFonts w:ascii="Calibri" w:hAnsi="Calibri" w:eastAsia="ＭＳ 明朝" w:cs="Calibri" w:eastAsiaTheme="minorEastAsia" w:csTheme="minorBidi"/>
-          <w:b/>
-          <w:bCs/>
-          <w:i/>
-          <w:iCs/>
-          <w:color w:val="56606C"/>
-          <w:sz w:val="15"/>
-          <w:szCs w:val="18"/>
-        </w:rPr>
         <w:t>Table 3. Aggregate final results across 15 tasks. State bytes are cumulative added-state suffix bytes per trial.</w:t>
       </w:r>
     </w:p>
@@ -3253,22 +2587,21 @@
       </w:pPr>
       <w:r>
         <w:drawing>
-          <wp:inline distT="0" distB="0" distL="0" distR="0">
-            <wp:extent cx="5895975" cy="2819400"/>
-            <wp:effectExtent l="0" t="0" r="0" b="0"/>
-            <wp:docPr id="100000" name="Grouped bar chart of exact success by task configuration and state strategy" descr="Grouped bar chart of exact success by task configuration and state strategy"/>
+          <wp:inline xmlns:a="http://schemas.openxmlformats.org/drawingml/2006/main" xmlns:pic="http://schemas.openxmlformats.org/drawingml/2006/picture">
+            <wp:extent cx="5897880" cy="2882671"/>
+            <wp:docPr id="1" name="Picture 1" title="Annotated heatmap of exact success by task configuration and state strategy" descr="Annotated heatmap of exact success by task configuration and state strategy"/>
             <wp:cNvGraphicFramePr>
-              <a:graphicFrameLocks xmlns:a="http://schemas.openxmlformats.org/drawingml/2006/main" noChangeAspect="1"/>
+              <a:graphicFrameLocks noChangeAspect="1"/>
             </wp:cNvGraphicFramePr>
-            <a:graphic xmlns:a="http://schemas.openxmlformats.org/drawingml/2006/main">
+            <a:graphic>
               <a:graphicData uri="http://schemas.openxmlformats.org/drawingml/2006/picture">
-                <pic:pic xmlns:pic="http://schemas.openxmlformats.org/drawingml/2006/picture">
+                <pic:pic>
                   <pic:nvPicPr>
-                    <pic:cNvPr id="100000" name="image100000" descr="Grouped bar chart of exact success by task configuration and state strategy"/>
+                    <pic:cNvPr id="0" name="reliability_by_configuration.png"/>
                     <pic:cNvPicPr/>
                   </pic:nvPicPr>
                   <pic:blipFill>
-                    <a:blip r:embed="rId15"/>
+                    <a:blip r:embed="rId11"/>
                     <a:stretch>
                       <a:fillRect/>
                     </a:stretch>
@@ -3276,11 +2609,9 @@
                   <pic:spPr>
                     <a:xfrm>
                       <a:off x="0" y="0"/>
-                      <a:ext cx="5895975" cy="2819400"/>
+                      <a:ext cx="5897880" cy="2882671"/>
                     </a:xfrm>
-                    <a:prstGeom prst="rect">
-                      <a:avLst/>
-                    </a:prstGeom>
+                    <a:prstGeom prst="rect"/>
                   </pic:spPr>
                 </pic:pic>
               </a:graphicData>
@@ -3295,16 +2626,6 @@
         <w:jc w:val="center"/>
       </w:pPr>
       <w:r>
-        <w:rPr>
-          <w:rFonts w:ascii="Calibri" w:hAnsi="Calibri" w:eastAsia="ＭＳ 明朝" w:cs="Calibri" w:eastAsiaTheme="minorEastAsia" w:csTheme="minorBidi"/>
-          <w:b/>
-          <w:bCs/>
-          <w:i/>
-          <w:iCs/>
-          <w:color w:val="56606C"/>
-          <w:sz w:val="15"/>
-          <w:szCs w:val="18"/>
-        </w:rPr>
         <w:t>Figure 1. Exact success by condition across five strategies; live pruning reached 3/5 on connected distractors.</w:t>
       </w:r>
     </w:p>
@@ -3316,22 +2637,21 @@
       </w:pPr>
       <w:r>
         <w:drawing>
-          <wp:inline distT="0" distB="0" distL="0" distR="0">
-            <wp:extent cx="6076950" cy="2076450"/>
-            <wp:effectExtent l="0" t="0" r="0" b="0"/>
-            <wp:docPr id="100001" name="Two-panel comparison of compact-state reliability and cumulative state bytes" descr="Two-panel comparison of compact-state reliability and cumulative state bytes"/>
+          <wp:inline xmlns:a="http://schemas.openxmlformats.org/drawingml/2006/main" xmlns:pic="http://schemas.openxmlformats.org/drawingml/2006/picture">
+            <wp:extent cx="6080760" cy="2280285"/>
+            <wp:docPr id="2" name="Picture 2" title="Two-panel line and dumbbell comparison of compact-state reliability and cumulative state bytes" descr="Two-panel line and dumbbell comparison of compact-state reliability and cumulative state bytes"/>
             <wp:cNvGraphicFramePr>
-              <a:graphicFrameLocks xmlns:a="http://schemas.openxmlformats.org/drawingml/2006/main" noChangeAspect="1"/>
+              <a:graphicFrameLocks noChangeAspect="1"/>
             </wp:cNvGraphicFramePr>
-            <a:graphic xmlns:a="http://schemas.openxmlformats.org/drawingml/2006/main">
+            <a:graphic>
               <a:graphicData uri="http://schemas.openxmlformats.org/drawingml/2006/picture">
-                <pic:pic xmlns:pic="http://schemas.openxmlformats.org/drawingml/2006/picture">
+                <pic:pic>
                   <pic:nvPicPr>
-                    <pic:cNvPr id="100001" name="image100001" descr="Two-panel comparison of compact-state reliability and cumulative state bytes"/>
+                    <pic:cNvPr id="0" name="live_pruning_comparison.png"/>
                     <pic:cNvPicPr/>
                   </pic:nvPicPr>
                   <pic:blipFill>
-                    <a:blip r:embed="rId16"/>
+                    <a:blip r:embed="rId12"/>
                     <a:stretch>
                       <a:fillRect/>
                     </a:stretch>
@@ -3339,11 +2659,9 @@
                   <pic:spPr>
                     <a:xfrm>
                       <a:off x="0" y="0"/>
-                      <a:ext cx="6076950" cy="2076450"/>
+                      <a:ext cx="6080760" cy="2280285"/>
                     </a:xfrm>
-                    <a:prstGeom prst="rect">
-                      <a:avLst/>
-                    </a:prstGeom>
+                    <a:prstGeom prst="rect"/>
                   </pic:spPr>
                 </pic:pic>
               </a:graphicData>
@@ -3358,17 +2676,7 @@
         <w:jc w:val="center"/>
       </w:pPr>
       <w:r>
-        <w:rPr>
-          <w:rFonts w:ascii="Calibri" w:hAnsi="Calibri" w:eastAsia="ＭＳ 明朝" w:cs="Calibri" w:eastAsiaTheme="minorEastAsia" w:csTheme="minorBidi"/>
-          <w:b/>
-          <w:bCs/>
-          <w:i/>
-          <w:iCs/>
-          <w:color w:val="56606C"/>
-          <w:sz w:val="15"/>
-          <w:szCs w:val="18"/>
-        </w:rPr>
-        <w:t>Figure 2. Reliability and added-state size for JSON, static dependency pruning, and live dependency pruning. Bytes measure cumulative suffix content added during a trial.</w:t>
+        <w:t>Figure 2. Left: reliability trajectories across difficulty. Right: live-pruning state reduction relative to the identical JSON/static baseline. Bytes measure cumulative suffix content added during a trial.</w:t>
       </w:r>
     </w:p>
     <w:p>
@@ -3378,10 +2686,11 @@
       </w:pPr>
       <w:r>
         <w:rPr>
-          <w:rFonts w:ascii="Calibri" w:hAnsi="Calibri" w:eastAsia="ＭＳ 明朝" w:cs="Calibri" w:eastAsiaTheme="minorEastAsia" w:csTheme="minorBidi"/>
+          <w:rFonts w:ascii="Calibri" w:hAnsi="Calibri"/>
+          <w:b w:val="0"/>
+          <w:i w:val="0"/>
           <w:color w:val="182535"/>
           <w:sz w:val="20"/>
-          <w:szCs w:val="22"/>
         </w:rPr>
         <w:t>Across 75 primary executions, live dependency pruning achieved 13/15, compared with 15/15 for JSON and legacy dependency pruning, 13/15 for paper restatement, and 12/15 for full history. Its average cumulative state suffix was 156.9 bytes versus 404.7 for JSON (61.2% lower), and it used 8,636 prompt tokens per success. Both live-pruning failures occurred on connected distractors and ended through reasoning-budget exhaustion. Prompt totals remain descriptive because failed trials can terminate early and hosted inference trajectories may differ even at temperature zero.</w:t>
       </w:r>
@@ -3391,14 +2700,6 @@
         <w:pStyle w:val="Heading1"/>
       </w:pPr>
       <w:r>
-        <w:rPr>
-          <w:rFonts w:ascii="Calibri" w:hAnsi="Calibri" w:eastAsia="ＭＳ ゴシック" w:cs="Calibri" w:asciiTheme="majorHAnsi" w:hAnsiTheme="majorHAnsi" w:eastAsiaTheme="majorEastAsia" w:csTheme="majorBidi"/>
-          <w:b/>
-          <w:bCs/>
-          <w:color w:val="2E74B5"/>
-          <w:sz w:val="24"/>
-          <w:szCs w:val="28"/>
-        </w:rPr>
         <w:t>5. Discussion &amp; Analysis</w:t>
       </w:r>
     </w:p>
@@ -3409,10 +2710,11 @@
       </w:pPr>
       <w:r>
         <w:rPr>
-          <w:rFonts w:ascii="Calibri" w:hAnsi="Calibri" w:eastAsia="ＭＳ 明朝" w:cs="Calibri" w:eastAsiaTheme="minorEastAsia" w:csTheme="minorBidi"/>
+          <w:rFonts w:ascii="Calibri" w:hAnsi="Calibri"/>
+          <w:b w:val="0"/>
+          <w:i w:val="0"/>
           <w:color w:val="182535"/>
           <w:sz w:val="20"/>
-          <w:szCs w:val="22"/>
         </w:rPr>
         <w:t>The strongest result is conditional rather than universal. On easy tasks, full history failed one seed while every original explicit-state strategy succeeded. On deep tasks without distractors, the original four strategies reached 5/5. Adding ten connected irrelevant functions reduced full history to 3/5, reproducing the paper's qualitative claim that type-compatible distractors confuse dependency selection. JSON and static dependency pruning remained 5/5, recovering both connected full-history failures and the single easy failure. Live dependency pruning achieved 13/15 overall and 3/5 on connected tasks.</w:t>
       </w:r>
@@ -3424,10 +2726,11 @@
       </w:pPr>
       <w:r>
         <w:rPr>
-          <w:rFonts w:ascii="Calibri" w:hAnsi="Calibri" w:eastAsia="ＭＳ 明朝" w:cs="Calibri" w:eastAsiaTheme="minorEastAsia" w:csTheme="minorBidi"/>
+          <w:rFonts w:ascii="Calibri" w:hAnsi="Calibri"/>
+          <w:b w:val="0"/>
+          <w:i w:val="0"/>
           <w:color w:val="182535"/>
           <w:sz w:val="20"/>
-          <w:szCs w:val="22"/>
         </w:rPr>
         <w:t>Paper restatement produced only a small aggregate gain: 13/15 versus 12/15. In the connected condition it succeeded on a full-history failure at seed 300 but failed a different seed 100, while both failed seed 400; its net result remained 3/5. This qualifies the paper's mitigation finding. Simply repeating every value was not sufficient for this model under the stress condition, whereas a compact machine-readable map was. Because the sample is small, this should be treated as evidence for further testing rather than proof that JSON formatting is intrinsically superior.</w:t>
       </w:r>
@@ -3439,10 +2742,11 @@
       </w:pPr>
       <w:r>
         <w:rPr>
-          <w:rFonts w:ascii="Calibri" w:hAnsi="Calibri" w:eastAsia="ＭＳ 明朝" w:cs="Calibri" w:eastAsiaTheme="minorEastAsia" w:csTheme="minorBidi"/>
+          <w:rFonts w:ascii="Calibri" w:hAnsi="Calibri"/>
+          <w:b w:val="0"/>
+          <w:i w:val="0"/>
           <w:color w:val="182535"/>
           <w:sz w:val="20"/>
-          <w:szCs w:val="22"/>
         </w:rPr>
         <w:t>Trace behavior clarifies the mechanism. Sixteen value-not-yet-known events and seven thinking-budget exhaustion events occurred across the five strategies, echoing the paper's state-availability and reasoning-capacity concerns. Under the compatible interface, the executor exposed premature calls instead of silently propagating a fabricated value, and compact-state runs sometimes recovered. The unsuccessful live-pruning runs both reached the 4,096-token per-turn allowance without producing another tool call or the target. This is a valid outcome under the fixed protocol, but it does not prove that pruning alone caused the looping behavior. Absolute success rates cannot be compared directly with the paper's model table.</w:t>
       </w:r>
@@ -3454,10 +2758,11 @@
       </w:pPr>
       <w:r>
         <w:rPr>
-          <w:rFonts w:ascii="Calibri" w:hAnsi="Calibri" w:eastAsia="ＭＳ 明朝" w:cs="Calibri" w:eastAsiaTheme="minorEastAsia" w:csTheme="minorBidi"/>
+          <w:rFonts w:ascii="Calibri" w:hAnsi="Calibri"/>
+          <w:b w:val="0"/>
+          <w:i w:val="0"/>
           <w:color w:val="182535"/>
           <w:sz w:val="20"/>
-          <w:szCs w:val="22"/>
         </w:rPr>
         <w:t>The follow-up resolves the implementation cause of the original pruning null. The static rule asked whether a type was consumed anywhere, so stale values survived after their relevant consumer had completed and distractor-only consumers widened the allow-list. Live dependency pruning used only public schema information to retire types outside the still-unresolved target frontier. It reduced average added-state bytes from 404.7 to 156.9 (61.2%). That compression did not preserve reliability: it achieved 13/15 overall and 3/5 on connected distractors, versus 15/15 and 5/5 for JSON and static pruning. The result suggests that reducing external reminders can increase the model's burden to reconstruct the path internally. Because there are only five fixtures per condition, this trade-off is descriptive rather than statistically established.</w:t>
       </w:r>
@@ -3467,15 +2772,23 @@
         <w:pStyle w:val="Heading1"/>
       </w:pPr>
       <w:r>
+        <w:t>6. Reflection on Learnings</w:t>
+      </w:r>
+    </w:p>
+    <w:p>
+      <w:pPr>
+        <w:widowControl/>
+        <w:spacing w:after="80"/>
+      </w:pPr>
+      <w:r>
         <w:rPr>
-          <w:rFonts w:ascii="Calibri" w:hAnsi="Calibri" w:eastAsia="ＭＳ ゴシック" w:cs="Calibri" w:asciiTheme="majorHAnsi" w:hAnsiTheme="majorHAnsi" w:eastAsiaTheme="majorEastAsia" w:csTheme="majorBidi"/>
-          <w:b/>
-          <w:bCs/>
-          <w:color w:val="2E74B5"/>
-          <w:sz w:val="24"/>
-          <w:szCs w:val="28"/>
+          <w:rFonts w:ascii="Calibri" w:hAnsi="Calibri"/>
+          <w:b w:val="0"/>
+          <w:i w:val="0"/>
+          <w:color w:val="182535"/>
+          <w:sz w:val="20"/>
         </w:rPr>
-        <w:t>6. Reflection on Learnings</w:t>
+        <w:t>This project taught me that reproducing an evaluation paper is not only about rerunning released code; the interaction contract between a benchmark and a model can determine whether the intended capability is measured at all. The most rewarding part was turning an initial all-failure local run into a controlled experiment without hiding negative findings or changing the core question. Rate limits, reasoning-budget exhaustion, and resumability were major implementation challenges. Frozen fixtures, viability gates, atomic checkpoints, and trace logging made the experiment recoverable. The static pruning null also taught me to inspect whether an intervention actually activates: rather than overclaiming, I traced the global-type rule, designed a public-schema liveness filter, and measured the follow-up separately. The activated filter demonstrated real compression, but its two connected-task failures reinforced that a smaller state is not automatically a better state.</w:t>
       </w:r>
     </w:p>
     <w:p>
@@ -3483,55 +2796,6 @@
         <w:pStyle w:val="Heading1"/>
       </w:pPr>
       <w:r>
-        <w:rPr>
-          <w:rFonts w:ascii="Calibri" w:hAnsi="Calibri" w:eastAsia="ＭＳ 明朝" w:cs="Calibri" w:eastAsiaTheme="minorEastAsia"/>
-          <w:color w:val="182535"/>
-          <w:sz w:val="20"/>
-          <w:szCs w:val="22"/>
-        </w:rPr>
-        <w:t xml:space="preserve">This project and fellowship as a whole were a great dive into theory that I have been missing. As someone who has been building with AI, developing AI tools and leveraging agents, this look behind the scenes was extremely valuable. I discovered that deepening my understanding simply had to come from a step back into the basics, and a step forward into innovation. And while reproducing a research paper first felt like simply running experiments and code that was already written, attempting to look for an extension was the part where I understood that the attempt is what matters when trying to come up with something new. Perserverance eventually leads to breakthrough, and sometimes the </w:t>
-      </w:r>
-      <w:r>
-        <w:rPr>
-          <w:rFonts w:ascii="Calibri" w:hAnsi="Calibri" w:eastAsia="ＭＳ 明朝" w:cs="Calibri" w:eastAsiaTheme="minorEastAsia"/>
-          <w:b/>
-          <w:bCs/>
-          <w:color w:val="182535"/>
-          <w:sz w:val="20"/>
-          <w:szCs w:val="22"/>
-        </w:rPr>
-        <w:t>breakthrough is in the mind.</w:t>
-      </w:r>
-    </w:p>
-    <w:p>
-      <w:pPr>
-        <w:pStyle w:val="Heading1"/>
-      </w:pPr>
-      <w:r>
-        <w:rPr>
-          <w:rFonts w:ascii="Calibri" w:hAnsi="Calibri" w:eastAsia="ＭＳ 明朝" w:cs="Calibri" w:eastAsiaTheme="minorEastAsia"/>
-          <w:b/>
-          <w:bCs/>
-          <w:color w:val="182535"/>
-          <w:sz w:val="20"/>
-          <w:szCs w:val="22"/>
-        </w:rPr>
-        <w:t>The most rewarding part was turning an initial all-failure local run into a controlled experiment without hiding negative findings or changing the core question. Rate limits, reasoning-budget exhaustion, and resumability were major implementation challenges. I tried running models locally, and ran the experiment with a Qwen3-8B model, unsuccessfully, so I went back to the API. Frozen fixtures, viability gates, atomic checkpoints, and trace logging made the experiment recoverable. The static pruning null also taught me to inspect whether an intervention actually activates: rather than overclaiming, I traced the global-type rule, designed a public-schema liveness filter, and measured the follow-up separately. The activated filter demonstrated real compression, but its two connected-task failures reinforced that a smaller state is not automatically a better state.</w:t>
-      </w:r>
-    </w:p>
-    <w:p>
-      <w:pPr>
-        <w:pStyle w:val="Heading1"/>
-      </w:pPr>
-      <w:r>
-        <w:rPr>
-          <w:rFonts w:ascii="Calibri" w:hAnsi="Calibri" w:eastAsia="ＭＳ ゴシック" w:cs="Calibri" w:asciiTheme="majorHAnsi" w:hAnsiTheme="majorHAnsi" w:eastAsiaTheme="majorEastAsia" w:csTheme="majorBidi"/>
-          <w:b/>
-          <w:bCs/>
-          <w:color w:val="2E74B5"/>
-          <w:sz w:val="24"/>
-          <w:szCs w:val="28"/>
-        </w:rPr>
         <w:t>References</w:t>
       </w:r>
     </w:p>
@@ -3542,10 +2806,11 @@
       </w:pPr>
       <w:r>
         <w:rPr>
-          <w:rFonts w:ascii="Calibri" w:hAnsi="Calibri" w:eastAsia="ＭＳ 明朝" w:cs="Calibri" w:eastAsiaTheme="minorEastAsia" w:csTheme="minorBidi"/>
+          <w:rFonts w:ascii="Calibri" w:hAnsi="Calibri"/>
+          <w:b w:val="0"/>
+          <w:i w:val="0"/>
           <w:color w:val="182535"/>
           <w:sz w:val="20"/>
-          <w:szCs w:val="22"/>
         </w:rPr>
         <w:t>[1] Maekawa, S., Hassell, J., Pezeshkpour, P., Mitchell, T., and Hruschka, E. (2026). Towards Reliable Benchmarking: A Contamination Free, Controllable Evaluation Framework for Multi-step LLM Function Calling. ICLR 2026; arXiv:2509.26553v2.</w:t>
       </w:r>
@@ -3557,10 +2822,11 @@
       </w:pPr>
       <w:r>
         <w:rPr>
-          <w:rFonts w:ascii="Calibri" w:hAnsi="Calibri" w:eastAsia="ＭＳ 明朝" w:cs="Calibri" w:eastAsiaTheme="minorEastAsia" w:csTheme="minorBidi"/>
+          <w:rFonts w:ascii="Calibri" w:hAnsi="Calibri"/>
+          <w:b w:val="0"/>
+          <w:i w:val="0"/>
           <w:color w:val="182535"/>
           <w:sz w:val="20"/>
-          <w:szCs w:val="22"/>
         </w:rPr>
         <w:t>[2] Megagon Labs. FuncBenchGen code release, commit 0718d1cf25b601d0b25fbbbbd064525536cea876. Model: qwen/qwen3.6-27b via Groq.</w:t>
       </w:r>
@@ -3570,6 +2836,7 @@
       <w:footerReference w:type="default" r:id="rId10"/>
       <w:pgSz w:w="12240" w:h="15840"/>
       <w:pgMar w:top="979" w:right="1080" w:bottom="1008" w:left="1080" w:header="403" w:footer="403" w:gutter="0"/>
+      <w:cols w:space="720"/>
       <w:docGrid w:linePitch="360"/>
     </w:sectPr>
   </w:body>
@@ -3577,7 +2844,7 @@
 </file>
 
 <file path=word/footer1.xml><?xml version="1.0" encoding="utf-8"?>
-<w:ftr xmlns:wpc="http://schemas.microsoft.com/office/word/2010/wordprocessingCanvas" xmlns:mc="http://schemas.openxmlformats.org/markup-compatibility/2006" xmlns:o="urn:schemas-microsoft-com:office:office" xmlns:r="http://schemas.openxmlformats.org/officeDocument/2006/relationships" xmlns:m="http://schemas.openxmlformats.org/officeDocument/2006/math" xmlns:v="urn:schemas-microsoft-com:vml" xmlns:wp14="http://schemas.microsoft.com/office/word/2010/wordprocessingDrawing" xmlns:wp="http://schemas.openxmlformats.org/drawingml/2006/wordprocessingDrawing" xmlns:w10="urn:schemas-microsoft-com:office:word" xmlns:w="http://schemas.openxmlformats.org/wordprocessingml/2006/main" xmlns:w14="http://schemas.microsoft.com/office/word/2010/wordml" xmlns:w15="http://schemas.microsoft.com/office/word/2012/wordml" xmlns:w16se="http://schemas.microsoft.com/office/word/2015/wordml/symex" xmlns:w16cid="http://schemas.microsoft.com/office/word/2016/wordml/cid" xmlns:w16="http://schemas.microsoft.com/office/word/2018/wordml" xmlns:w16cex="http://schemas.microsoft.com/office/word/2018/wordml/cex" xmlns:w16sdtdh="http://schemas.microsoft.com/office/word/2020/wordml/sdtdatahash" xmlns:wne="http://schemas.microsoft.com/office/word/2006/wordml" xmlns:wpg="http://schemas.microsoft.com/office/word/2010/wordprocessingGroup" xmlns:wps="http://schemas.microsoft.com/office/word/2010/wordprocessingShape">
+<w:ftr xmlns:m="http://schemas.openxmlformats.org/officeDocument/2006/math" xmlns:mc="http://schemas.openxmlformats.org/markup-compatibility/2006" xmlns:mo="http://schemas.microsoft.com/office/mac/office/2008/main" xmlns:mv="urn:schemas-microsoft-com:mac:vml" xmlns:o="urn:schemas-microsoft-com:office:office" xmlns:r="http://schemas.openxmlformats.org/officeDocument/2006/relationships" xmlns:v="urn:schemas-microsoft-com:vml" xmlns:w10="urn:schemas-microsoft-com:office:word" xmlns:w14="http://schemas.microsoft.com/office/word/2010/wordml" xmlns:w="http://schemas.openxmlformats.org/wordprocessingml/2006/main" xmlns:wne="http://schemas.microsoft.com/office/word/2006/wordml" xmlns:wp14="http://schemas.microsoft.com/office/word/2010/wordprocessingDrawing" xmlns:wp="http://schemas.openxmlformats.org/drawingml/2006/wordprocessingDrawing" xmlns:wpc="http://schemas.microsoft.com/office/word/2010/wordprocessingCanvas" xmlns:wpg="http://schemas.microsoft.com/office/word/2010/wordprocessingGroup" xmlns:wpi="http://schemas.microsoft.com/office/word/2010/wordprocessingInk" xmlns:wps="http://schemas.microsoft.com/office/word/2010/wordprocessingShape" mc:Ignorable="w14 wp14">
   <w:p>
     <w:pPr>
       <w:pStyle w:val="Footer"/>
@@ -3613,7 +2880,7 @@
 </file>
 
 <file path=word/header1.xml><?xml version="1.0" encoding="utf-8"?>
-<w:hdr xmlns:wpc="http://schemas.microsoft.com/office/word/2010/wordprocessingCanvas" xmlns:mc="http://schemas.openxmlformats.org/markup-compatibility/2006" xmlns:o="urn:schemas-microsoft-com:office:office" xmlns:r="http://schemas.openxmlformats.org/officeDocument/2006/relationships" xmlns:m="http://schemas.openxmlformats.org/officeDocument/2006/math" xmlns:v="urn:schemas-microsoft-com:vml" xmlns:wp14="http://schemas.microsoft.com/office/word/2010/wordprocessingDrawing" xmlns:wp="http://schemas.openxmlformats.org/drawingml/2006/wordprocessingDrawing" xmlns:w10="urn:schemas-microsoft-com:office:word" xmlns:w="http://schemas.openxmlformats.org/wordprocessingml/2006/main" xmlns:w14="http://schemas.microsoft.com/office/word/2010/wordml" xmlns:w15="http://schemas.microsoft.com/office/word/2012/wordml" xmlns:w16se="http://schemas.microsoft.com/office/word/2015/wordml/symex" xmlns:w16cid="http://schemas.microsoft.com/office/word/2016/wordml/cid" xmlns:w16="http://schemas.microsoft.com/office/word/2018/wordml" xmlns:w16cex="http://schemas.microsoft.com/office/word/2018/wordml/cex" xmlns:w16sdtdh="http://schemas.microsoft.com/office/word/2020/wordml/sdtdatahash" xmlns:wne="http://schemas.microsoft.com/office/word/2006/wordml" xmlns:wpg="http://schemas.microsoft.com/office/word/2010/wordprocessingGroup" xmlns:wps="http://schemas.microsoft.com/office/word/2010/wordprocessingShape">
+<w:hdr xmlns:m="http://schemas.openxmlformats.org/officeDocument/2006/math" xmlns:mc="http://schemas.openxmlformats.org/markup-compatibility/2006" xmlns:mo="http://schemas.microsoft.com/office/mac/office/2008/main" xmlns:mv="urn:schemas-microsoft-com:mac:vml" xmlns:o="urn:schemas-microsoft-com:office:office" xmlns:r="http://schemas.openxmlformats.org/officeDocument/2006/relationships" xmlns:v="urn:schemas-microsoft-com:vml" xmlns:w10="urn:schemas-microsoft-com:office:word" xmlns:w14="http://schemas.microsoft.com/office/word/2010/wordml" xmlns:w="http://schemas.openxmlformats.org/wordprocessingml/2006/main" xmlns:wne="http://schemas.microsoft.com/office/word/2006/wordml" xmlns:wp14="http://schemas.microsoft.com/office/word/2010/wordprocessingDrawing" xmlns:wp="http://schemas.openxmlformats.org/drawingml/2006/wordprocessingDrawing" xmlns:wpc="http://schemas.microsoft.com/office/word/2010/wordprocessingCanvas" xmlns:wpg="http://schemas.microsoft.com/office/word/2010/wordprocessingGroup" xmlns:wpi="http://schemas.microsoft.com/office/word/2010/wordprocessingInk" xmlns:wps="http://schemas.microsoft.com/office/word/2010/wordprocessingShape" mc:Ignorable="w14 wp14">
   <w:p>
     <w:pPr>
       <w:pStyle w:val="Header"/>
@@ -3622,14 +2889,12 @@
     </w:pPr>
     <w:r>
       <w:rPr>
-        <w:rFonts w:ascii="Calibri" w:hAnsi="Calibri" w:eastAsia="ＭＳ 明朝" w:cs="Calibri" w:eastAsiaTheme="minorEastAsia" w:csTheme="minorBidi"/>
-        <w:b/>
-        <w:bCs/>
+        <w:rFonts w:ascii="Calibri" w:hAnsi="Calibri"/>
+        <w:b/>
         <w:color w:val="56606C"/>
         <w:sz w:val="15"/>
-        <w:szCs w:val="22"/>
-      </w:rPr>
-      <w:t>LEBNET TECH FELLOWS 2026 | DOMENICO LABAKI | RESEARCH REPORT</w:t>
+      </w:rPr>
+      <w:t>LEBNET TECH FELLOWS 2026 | RESEARCH REPORT</w:t>
     </w:r>
   </w:p>
 </w:hdr>

</xml_diff>